<commit_message>
Aanpassing woording testplan, aanmaak experimenteel onderzoek en eerste invulling
</commit_message>
<xml_diff>
--- a/Opleverset/Documentatie/Testplan.docx
+++ b/Opleverset/Documentatie/Testplan.docx
@@ -23,9 +23,21 @@
           <w:ilvl w:val="0"/>
           <w:numId w:val="5"/>
         </w:numPr>
-      </w:pPr>
-      <w:r>
+        <w:rPr>
+          <w:color w:val="4EA72E" w:themeColor="accent6"/>
+        </w:rPr>
+      </w:pPr>
+      <w:r>
+        <w:rPr>
+          <w:color w:val="4EA72E" w:themeColor="accent6"/>
+        </w:rPr>
         <w:t>Functionaliteit van de sensor</w:t>
+      </w:r>
+      <w:r>
+        <w:rPr>
+          <w:color w:val="4EA72E" w:themeColor="accent6"/>
+        </w:rPr>
+        <w:t xml:space="preserve"> </w:t>
       </w:r>
     </w:p>
     <w:p>
@@ -35,8 +47,14 @@
           <w:ilvl w:val="0"/>
           <w:numId w:val="5"/>
         </w:numPr>
-      </w:pPr>
-      <w:r>
+        <w:rPr>
+          <w:color w:val="4EA72E" w:themeColor="accent6"/>
+        </w:rPr>
+      </w:pPr>
+      <w:r>
+        <w:rPr>
+          <w:color w:val="4EA72E" w:themeColor="accent6"/>
+        </w:rPr>
         <w:t>Robuustheid van het schaalmodel</w:t>
       </w:r>
     </w:p>
@@ -47,8 +65,14 @@
           <w:ilvl w:val="0"/>
           <w:numId w:val="5"/>
         </w:numPr>
-      </w:pPr>
-      <w:r>
+        <w:rPr>
+          <w:color w:val="4EA72E" w:themeColor="accent6"/>
+        </w:rPr>
+      </w:pPr>
+      <w:r>
+        <w:rPr>
+          <w:color w:val="4EA72E" w:themeColor="accent6"/>
+        </w:rPr>
         <w:t>Aansturing van de pompen</w:t>
       </w:r>
     </w:p>
@@ -59,8 +83,14 @@
           <w:ilvl w:val="0"/>
           <w:numId w:val="5"/>
         </w:numPr>
-      </w:pPr>
-      <w:r>
+        <w:rPr>
+          <w:color w:val="4EA72E" w:themeColor="accent6"/>
+        </w:rPr>
+      </w:pPr>
+      <w:r>
+        <w:rPr>
+          <w:color w:val="4EA72E" w:themeColor="accent6"/>
+        </w:rPr>
         <w:t>Updaten van interface</w:t>
       </w:r>
     </w:p>
@@ -71,180 +101,537 @@
           <w:ilvl w:val="0"/>
           <w:numId w:val="5"/>
         </w:numPr>
-      </w:pPr>
-      <w:r>
-        <w:t>Functionaliteit waterpompen</w:t>
+        <w:shd w:val="clear" w:color="auto" w:fill="FFFFFF" w:themeFill="background1"/>
+        <w:rPr>
+          <w:color w:val="000000" w:themeColor="text1"/>
+        </w:rPr>
+      </w:pPr>
+    </w:p>
+    <w:p>
+      <w:pPr>
+        <w:pStyle w:val="TOC1"/>
+        <w:tabs>
+          <w:tab w:val="right" w:leader="dot" w:pos="9062"/>
+        </w:tabs>
+        <w:rPr>
+          <w:rFonts w:eastAsiaTheme="minorEastAsia"/>
+          <w:noProof/>
+          <w:sz w:val="24"/>
+          <w:szCs w:val="24"/>
+          <w:lang w:eastAsia="nl-NL"/>
+        </w:rPr>
+      </w:pPr>
+      <w:r>
+        <w:fldChar w:fldCharType="begin"/>
+      </w:r>
+      <w:r>
+        <w:instrText xml:space="preserve"> TOC \o "1-1" \h \z \u </w:instrText>
+      </w:r>
+      <w:r>
+        <w:fldChar w:fldCharType="separate"/>
+      </w:r>
+      <w:hyperlink w:anchor="_Toc217033196" w:history="1">
+        <w:r>
+          <w:rPr>
+            <w:rStyle w:val="Hyperlink"/>
+            <w:noProof/>
+          </w:rPr>
+          <w:t>Test 1: Het schaalmodel kan drijven op water</w:t>
+        </w:r>
+        <w:r>
+          <w:rPr>
+            <w:noProof/>
+            <w:webHidden/>
+          </w:rPr>
+          <w:tab/>
+        </w:r>
+        <w:r>
+          <w:rPr>
+            <w:noProof/>
+            <w:webHidden/>
+          </w:rPr>
+          <w:fldChar w:fldCharType="begin"/>
+        </w:r>
+        <w:r>
+          <w:rPr>
+            <w:noProof/>
+            <w:webHidden/>
+          </w:rPr>
+          <w:instrText xml:space="preserve"> PAGEREF _Toc217033196 \h </w:instrText>
+        </w:r>
+        <w:r>
+          <w:rPr>
+            <w:noProof/>
+            <w:webHidden/>
+          </w:rPr>
+        </w:r>
+        <w:r>
+          <w:rPr>
+            <w:noProof/>
+            <w:webHidden/>
+          </w:rPr>
+          <w:fldChar w:fldCharType="separate"/>
+        </w:r>
+        <w:r>
+          <w:rPr>
+            <w:noProof/>
+            <w:webHidden/>
+          </w:rPr>
+          <w:t>3</w:t>
+        </w:r>
+        <w:r>
+          <w:rPr>
+            <w:noProof/>
+            <w:webHidden/>
+          </w:rPr>
+          <w:fldChar w:fldCharType="end"/>
+        </w:r>
+      </w:hyperlink>
+    </w:p>
+    <w:p>
+      <w:pPr>
+        <w:pStyle w:val="TOC1"/>
+        <w:tabs>
+          <w:tab w:val="right" w:leader="dot" w:pos="9062"/>
+        </w:tabs>
+        <w:rPr>
+          <w:rFonts w:eastAsiaTheme="minorEastAsia"/>
+          <w:noProof/>
+          <w:sz w:val="24"/>
+          <w:szCs w:val="24"/>
+          <w:lang w:eastAsia="nl-NL"/>
+        </w:rPr>
+      </w:pPr>
+      <w:hyperlink w:anchor="_Toc217033197" w:history="1">
+        <w:r>
+          <w:rPr>
+            <w:rStyle w:val="Hyperlink"/>
+            <w:noProof/>
+          </w:rPr>
+          <w:t>Test 2: Sensorlezingen op waterpas</w:t>
+        </w:r>
+        <w:r>
+          <w:rPr>
+            <w:noProof/>
+            <w:webHidden/>
+          </w:rPr>
+          <w:tab/>
+        </w:r>
+        <w:r>
+          <w:rPr>
+            <w:noProof/>
+            <w:webHidden/>
+          </w:rPr>
+          <w:fldChar w:fldCharType="begin"/>
+        </w:r>
+        <w:r>
+          <w:rPr>
+            <w:noProof/>
+            <w:webHidden/>
+          </w:rPr>
+          <w:instrText xml:space="preserve"> PAGEREF _Toc217033197 \h </w:instrText>
+        </w:r>
+        <w:r>
+          <w:rPr>
+            <w:noProof/>
+            <w:webHidden/>
+          </w:rPr>
+        </w:r>
+        <w:r>
+          <w:rPr>
+            <w:noProof/>
+            <w:webHidden/>
+          </w:rPr>
+          <w:fldChar w:fldCharType="separate"/>
+        </w:r>
+        <w:r>
+          <w:rPr>
+            <w:noProof/>
+            <w:webHidden/>
+          </w:rPr>
+          <w:t>4</w:t>
+        </w:r>
+        <w:r>
+          <w:rPr>
+            <w:noProof/>
+            <w:webHidden/>
+          </w:rPr>
+          <w:fldChar w:fldCharType="end"/>
+        </w:r>
+      </w:hyperlink>
+    </w:p>
+    <w:p>
+      <w:pPr>
+        <w:pStyle w:val="TOC1"/>
+        <w:tabs>
+          <w:tab w:val="right" w:leader="dot" w:pos="9062"/>
+        </w:tabs>
+        <w:rPr>
+          <w:rFonts w:eastAsiaTheme="minorEastAsia"/>
+          <w:noProof/>
+          <w:sz w:val="24"/>
+          <w:szCs w:val="24"/>
+          <w:lang w:eastAsia="nl-NL"/>
+        </w:rPr>
+      </w:pPr>
+      <w:hyperlink w:anchor="_Toc217033198" w:history="1">
+        <w:r>
+          <w:rPr>
+            <w:rStyle w:val="Hyperlink"/>
+            <w:noProof/>
+          </w:rPr>
+          <w:t>Test 3: Update interface</w:t>
+        </w:r>
+        <w:r>
+          <w:rPr>
+            <w:noProof/>
+            <w:webHidden/>
+          </w:rPr>
+          <w:tab/>
+        </w:r>
+        <w:r>
+          <w:rPr>
+            <w:noProof/>
+            <w:webHidden/>
+          </w:rPr>
+          <w:fldChar w:fldCharType="begin"/>
+        </w:r>
+        <w:r>
+          <w:rPr>
+            <w:noProof/>
+            <w:webHidden/>
+          </w:rPr>
+          <w:instrText xml:space="preserve"> PAGEREF _Toc217033198 \h </w:instrText>
+        </w:r>
+        <w:r>
+          <w:rPr>
+            <w:noProof/>
+            <w:webHidden/>
+          </w:rPr>
+        </w:r>
+        <w:r>
+          <w:rPr>
+            <w:noProof/>
+            <w:webHidden/>
+          </w:rPr>
+          <w:fldChar w:fldCharType="separate"/>
+        </w:r>
+        <w:r>
+          <w:rPr>
+            <w:noProof/>
+            <w:webHidden/>
+          </w:rPr>
+          <w:t>5</w:t>
+        </w:r>
+        <w:r>
+          <w:rPr>
+            <w:noProof/>
+            <w:webHidden/>
+          </w:rPr>
+          <w:fldChar w:fldCharType="end"/>
+        </w:r>
+      </w:hyperlink>
+    </w:p>
+    <w:p>
+      <w:pPr>
+        <w:pStyle w:val="TOC1"/>
+        <w:tabs>
+          <w:tab w:val="right" w:leader="dot" w:pos="9062"/>
+        </w:tabs>
+        <w:rPr>
+          <w:rFonts w:eastAsiaTheme="minorEastAsia"/>
+          <w:noProof/>
+          <w:sz w:val="24"/>
+          <w:szCs w:val="24"/>
+          <w:lang w:eastAsia="nl-NL"/>
+        </w:rPr>
+      </w:pPr>
+      <w:hyperlink w:anchor="_Toc217033199" w:history="1">
+        <w:r>
+          <w:rPr>
+            <w:rStyle w:val="Hyperlink"/>
+            <w:noProof/>
+          </w:rPr>
+          <w:t>Test 4:  Aansturen van de waterpompen met Mosfets</w:t>
+        </w:r>
+        <w:r>
+          <w:rPr>
+            <w:noProof/>
+            <w:webHidden/>
+          </w:rPr>
+          <w:tab/>
+        </w:r>
+        <w:r>
+          <w:rPr>
+            <w:noProof/>
+            <w:webHidden/>
+          </w:rPr>
+          <w:fldChar w:fldCharType="begin"/>
+        </w:r>
+        <w:r>
+          <w:rPr>
+            <w:noProof/>
+            <w:webHidden/>
+          </w:rPr>
+          <w:instrText xml:space="preserve"> PAGEREF _Toc217033199 \h </w:instrText>
+        </w:r>
+        <w:r>
+          <w:rPr>
+            <w:noProof/>
+            <w:webHidden/>
+          </w:rPr>
+        </w:r>
+        <w:r>
+          <w:rPr>
+            <w:noProof/>
+            <w:webHidden/>
+          </w:rPr>
+          <w:fldChar w:fldCharType="separate"/>
+        </w:r>
+        <w:r>
+          <w:rPr>
+            <w:noProof/>
+            <w:webHidden/>
+          </w:rPr>
+          <w:t>6</w:t>
+        </w:r>
+        <w:r>
+          <w:rPr>
+            <w:noProof/>
+            <w:webHidden/>
+          </w:rPr>
+          <w:fldChar w:fldCharType="end"/>
+        </w:r>
+      </w:hyperlink>
+    </w:p>
+    <w:p>
+      <w:pPr>
+        <w:pStyle w:val="TOC1"/>
+        <w:tabs>
+          <w:tab w:val="right" w:leader="dot" w:pos="9062"/>
+        </w:tabs>
+        <w:rPr>
+          <w:rFonts w:eastAsiaTheme="minorEastAsia"/>
+          <w:noProof/>
+          <w:sz w:val="24"/>
+          <w:szCs w:val="24"/>
+          <w:lang w:eastAsia="nl-NL"/>
+        </w:rPr>
+      </w:pPr>
+      <w:hyperlink w:anchor="_Toc217033200" w:history="1">
+        <w:r>
+          <w:rPr>
+            <w:rStyle w:val="Hyperlink"/>
+            <w:noProof/>
+          </w:rPr>
+          <w:t>Test 5: Algoritme gebaseerd op sensordata</w:t>
+        </w:r>
+        <w:r>
+          <w:rPr>
+            <w:noProof/>
+            <w:webHidden/>
+          </w:rPr>
+          <w:tab/>
+        </w:r>
+        <w:r>
+          <w:rPr>
+            <w:noProof/>
+            <w:webHidden/>
+          </w:rPr>
+          <w:fldChar w:fldCharType="begin"/>
+        </w:r>
+        <w:r>
+          <w:rPr>
+            <w:noProof/>
+            <w:webHidden/>
+          </w:rPr>
+          <w:instrText xml:space="preserve"> PAGEREF _Toc217033200 \h </w:instrText>
+        </w:r>
+        <w:r>
+          <w:rPr>
+            <w:noProof/>
+            <w:webHidden/>
+          </w:rPr>
+        </w:r>
+        <w:r>
+          <w:rPr>
+            <w:noProof/>
+            <w:webHidden/>
+          </w:rPr>
+          <w:fldChar w:fldCharType="separate"/>
+        </w:r>
+        <w:r>
+          <w:rPr>
+            <w:noProof/>
+            <w:webHidden/>
+          </w:rPr>
+          <w:t>7</w:t>
+        </w:r>
+        <w:r>
+          <w:rPr>
+            <w:noProof/>
+            <w:webHidden/>
+          </w:rPr>
+          <w:fldChar w:fldCharType="end"/>
+        </w:r>
+      </w:hyperlink>
+    </w:p>
+    <w:p>
+      <w:pPr>
+        <w:pStyle w:val="TOC1"/>
+        <w:tabs>
+          <w:tab w:val="right" w:leader="dot" w:pos="9062"/>
+        </w:tabs>
+        <w:rPr>
+          <w:rFonts w:eastAsiaTheme="minorEastAsia"/>
+          <w:noProof/>
+          <w:sz w:val="24"/>
+          <w:szCs w:val="24"/>
+          <w:lang w:eastAsia="nl-NL"/>
+        </w:rPr>
+      </w:pPr>
+      <w:hyperlink w:anchor="_Toc217033201" w:history="1">
+        <w:r>
+          <w:rPr>
+            <w:rStyle w:val="Hyperlink"/>
+            <w:noProof/>
+          </w:rPr>
+          <w:t>Test 6 : …</w:t>
+        </w:r>
+        <w:r>
+          <w:rPr>
+            <w:noProof/>
+            <w:webHidden/>
+          </w:rPr>
+          <w:tab/>
+        </w:r>
+        <w:r>
+          <w:rPr>
+            <w:noProof/>
+            <w:webHidden/>
+          </w:rPr>
+          <w:fldChar w:fldCharType="begin"/>
+        </w:r>
+        <w:r>
+          <w:rPr>
+            <w:noProof/>
+            <w:webHidden/>
+          </w:rPr>
+          <w:instrText xml:space="preserve"> PAGEREF _Toc217033201 \h </w:instrText>
+        </w:r>
+        <w:r>
+          <w:rPr>
+            <w:noProof/>
+            <w:webHidden/>
+          </w:rPr>
+        </w:r>
+        <w:r>
+          <w:rPr>
+            <w:noProof/>
+            <w:webHidden/>
+          </w:rPr>
+          <w:fldChar w:fldCharType="separate"/>
+        </w:r>
+        <w:r>
+          <w:rPr>
+            <w:noProof/>
+            <w:webHidden/>
+          </w:rPr>
+          <w:t>8</w:t>
+        </w:r>
+        <w:r>
+          <w:rPr>
+            <w:noProof/>
+            <w:webHidden/>
+          </w:rPr>
+          <w:fldChar w:fldCharType="end"/>
+        </w:r>
+      </w:hyperlink>
+    </w:p>
+    <w:p>
+      <w:pPr>
+        <w:pStyle w:val="TOC1"/>
+        <w:tabs>
+          <w:tab w:val="right" w:leader="dot" w:pos="9062"/>
+        </w:tabs>
+        <w:rPr>
+          <w:rStyle w:val="Hyperlink"/>
+          <w:noProof/>
+        </w:rPr>
+      </w:pPr>
+      <w:hyperlink w:anchor="_Toc217033202" w:history="1">
+        <w:r>
+          <w:rPr>
+            <w:rStyle w:val="Hyperlink"/>
+            <w:noProof/>
+          </w:rPr>
+          <w:t>Changelog</w:t>
+        </w:r>
+        <w:r>
+          <w:rPr>
+            <w:noProof/>
+            <w:webHidden/>
+          </w:rPr>
+          <w:tab/>
+        </w:r>
+        <w:r>
+          <w:rPr>
+            <w:noProof/>
+            <w:webHidden/>
+          </w:rPr>
+          <w:fldChar w:fldCharType="begin"/>
+        </w:r>
+        <w:r>
+          <w:rPr>
+            <w:noProof/>
+            <w:webHidden/>
+          </w:rPr>
+          <w:instrText xml:space="preserve"> PAGEREF _Toc217033202 \h </w:instrText>
+        </w:r>
+        <w:r>
+          <w:rPr>
+            <w:noProof/>
+            <w:webHidden/>
+          </w:rPr>
+        </w:r>
+        <w:r>
+          <w:rPr>
+            <w:noProof/>
+            <w:webHidden/>
+          </w:rPr>
+          <w:fldChar w:fldCharType="separate"/>
+        </w:r>
+        <w:r>
+          <w:rPr>
+            <w:noProof/>
+            <w:webHidden/>
+          </w:rPr>
+          <w:t>9</w:t>
+        </w:r>
+        <w:r>
+          <w:rPr>
+            <w:noProof/>
+            <w:webHidden/>
+          </w:rPr>
+          <w:fldChar w:fldCharType="end"/>
+        </w:r>
+      </w:hyperlink>
+    </w:p>
+    <w:p/>
+    <w:p/>
+    <w:p>
+      <w:r>
+        <w:fldChar w:fldCharType="end"/>
+      </w:r>
+      <w:r>
+        <w:br w:type="page"/>
       </w:r>
     </w:p>
     <w:p>
       <w:pPr>
         <w:pStyle w:val="Heading1"/>
       </w:pPr>
-      <w:r>
-        <w:t>//TODO</w:t>
-      </w:r>
-    </w:p>
-    <w:p>
-      <w:r>
-        <w:t>Toevoegen verwijzingen naar de code en schema’s etc. etc.</w:t>
-      </w:r>
-    </w:p>
-    <w:p>
-      <w:pPr>
-        <w:pStyle w:val="ListParagraph"/>
-        <w:numPr>
-          <w:ilvl w:val="0"/>
-          <w:numId w:val="5"/>
-        </w:numPr>
-      </w:pPr>
-      <w:r>
-        <w:t>Gebruik sensordata om aansturing waterpompen te bepalen</w:t>
-      </w:r>
-    </w:p>
-    <w:p/>
-    <w:p>
-      <w:r>
-        <w:br w:type="page"/>
-      </w:r>
-    </w:p>
-    <w:p>
-      <w:pPr>
-        <w:pStyle w:val="Heading1"/>
-      </w:pPr>
-      <w:r>
-        <w:lastRenderedPageBreak/>
-        <w:t xml:space="preserve">Test </w:t>
-      </w:r>
-      <w:r>
-        <w:t>(</w:t>
-      </w:r>
-      <w:proofErr w:type="spellStart"/>
-      <w:r>
-        <w:t>nr</w:t>
-      </w:r>
-      <w:proofErr w:type="spellEnd"/>
-      <w:r>
-        <w:t>)</w:t>
-      </w:r>
-      <w:r>
-        <w:t xml:space="preserve"> : …</w:t>
-      </w:r>
-    </w:p>
-    <w:p>
-      <w:pPr>
-        <w:pStyle w:val="Heading2"/>
-      </w:pPr>
-      <w:r>
-        <w:t>Testdoel</w:t>
-      </w:r>
-    </w:p>
-    <w:p>
-      <w:r>
-        <w:t>(Neem de lezer mee in de context van de test</w:t>
-      </w:r>
-      <w:r>
-        <w:t>, leg uit waarom deze test gedaan word</w:t>
-      </w:r>
-      <w:r>
-        <w:t>)</w:t>
-      </w:r>
-    </w:p>
-    <w:p>
-      <w:pPr>
-        <w:pStyle w:val="Heading2"/>
-      </w:pPr>
-      <w:r>
-        <w:t>Testopstelling</w:t>
-      </w:r>
-    </w:p>
-    <w:p>
-      <w:r>
-        <w:t>(Gedetailleerde en precieze instructies als tot hoe te test opgezet moet worden</w:t>
-      </w:r>
-      <w:r>
-        <w:t>, en wat ervoor nodig is</w:t>
-      </w:r>
-      <w:r>
-        <w:t>)</w:t>
-      </w:r>
-    </w:p>
-    <w:p>
-      <w:pPr>
-        <w:pStyle w:val="Heading2"/>
-      </w:pPr>
-      <w:r>
-        <w:t>Uitvoer</w:t>
-      </w:r>
-    </w:p>
-    <w:p>
-      <w:r>
-        <w:t>(Duidelijke instructies als tot wel handelingen er nodig zijn voor het uitvoeren van de test, voorkeurig met een stappenplan)</w:t>
-      </w:r>
-    </w:p>
-    <w:p>
-      <w:pPr>
-        <w:pStyle w:val="Heading2"/>
-      </w:pPr>
-      <w:r>
-        <w:t>Verwachte resultaat</w:t>
-      </w:r>
-    </w:p>
-    <w:p>
-      <w:r>
-        <w:t xml:space="preserve">(Wat word er verwacht te observeren? Niet altijd hetzelfde als acceptatiecriteria, testen is een iteratief proces.) </w:t>
-      </w:r>
-    </w:p>
-    <w:p>
-      <w:pPr>
-        <w:pStyle w:val="Heading2"/>
-      </w:pPr>
-      <w:r>
-        <w:t>Acceptatiecriteria</w:t>
-      </w:r>
-      <w:r>
-        <w:tab/>
-      </w:r>
-    </w:p>
-    <w:p>
-      <w:r>
-        <w:t>(Wanneer is de test voldaan? Wanneer werkt het tot behoren? Weer duidelijk, zorg dat de gebruiker/tester geen verdere vragen meer kan stellen.)</w:t>
-      </w:r>
-    </w:p>
-    <w:p>
-      <w:pPr>
-        <w:pStyle w:val="Heading2"/>
-      </w:pPr>
-      <w:r>
-        <w:t>Waarnemingen</w:t>
-      </w:r>
-    </w:p>
-    <w:p>
-      <w:r>
-        <w:t>(Feitelijke, objectieve observaties. Per test schrijf je op wat je ziet en er gebeurd, zonder conclusies te trekken.)</w:t>
-      </w:r>
-    </w:p>
-    <w:p>
-      <w:pPr>
-        <w:pStyle w:val="Heading2"/>
-      </w:pPr>
-      <w:r>
-        <w:t>Conclusie</w:t>
-      </w:r>
-    </w:p>
-    <w:p>
-      <w:r>
-        <w:t>(Hier beschrijf je je bevindingen. Houd je waarnemingen naast de acceptatiecriteria en stel dan of de test succesvol was of niet.)</w:t>
-      </w:r>
-    </w:p>
-    <w:p>
-      <w:r>
-        <w:br w:type="page"/>
-      </w:r>
-    </w:p>
-    <w:p>
-      <w:pPr>
-        <w:pStyle w:val="Heading1"/>
-      </w:pPr>
+      <w:bookmarkStart w:id="0" w:name="_Toc217033196"/>
       <w:r>
         <w:lastRenderedPageBreak/>
         <w:t>Test 1</w:t>
@@ -252,6 +639,7 @@
       <w:r>
         <w:t>: Het schaalmodel kan drijven op water</w:t>
       </w:r>
+      <w:bookmarkEnd w:id="0"/>
     </w:p>
     <w:p>
       <w:pPr>
@@ -387,11 +775,9 @@
             <w:r>
               <w:t xml:space="preserve">Test </w:t>
             </w:r>
-            <w:proofErr w:type="spellStart"/>
-            <w:r>
-              <w:t>nr</w:t>
-            </w:r>
-            <w:proofErr w:type="spellEnd"/>
+            <w:r>
+              <w:t>nr.</w:t>
+            </w:r>
           </w:p>
         </w:tc>
         <w:tc>
@@ -472,11 +858,9 @@
             <w:r>
               <w:t xml:space="preserve">Test </w:t>
             </w:r>
-            <w:proofErr w:type="spellStart"/>
-            <w:r>
-              <w:t>nr</w:t>
-            </w:r>
-            <w:proofErr w:type="spellEnd"/>
+            <w:r>
+              <w:t>nr.</w:t>
+            </w:r>
           </w:p>
         </w:tc>
         <w:tc>
@@ -537,10 +921,12 @@
       <w:pPr>
         <w:pStyle w:val="Heading1"/>
       </w:pPr>
+      <w:bookmarkStart w:id="1" w:name="_Toc217033197"/>
       <w:r>
         <w:lastRenderedPageBreak/>
         <w:t>Test 2: Sensorlezingen op waterpas</w:t>
       </w:r>
+      <w:bookmarkEnd w:id="1"/>
     </w:p>
     <w:p>
       <w:pPr>
@@ -552,7 +938,16 @@
     </w:p>
     <w:p>
       <w:r>
-        <w:t xml:space="preserve">Om te zorgen dat de lezingen niet beïnvloed worden door de schommelingen van de </w:t>
+        <w:t>Z</w:t>
+      </w:r>
+      <w:r>
+        <w:t>orgen dat</w:t>
+      </w:r>
+      <w:r>
+        <w:t xml:space="preserve"> het nulpunt </w:t>
+      </w:r>
+      <w:r>
+        <w:t xml:space="preserve">niet beïnvloed worden door de schommelingen van de </w:t>
       </w:r>
       <w:proofErr w:type="spellStart"/>
       <w:r>
@@ -779,11 +1174,9 @@
             <w:r>
               <w:t xml:space="preserve">Test </w:t>
             </w:r>
-            <w:proofErr w:type="spellStart"/>
-            <w:r>
-              <w:t>nr</w:t>
-            </w:r>
-            <w:proofErr w:type="spellEnd"/>
+            <w:r>
+              <w:t>nr.</w:t>
+            </w:r>
           </w:p>
         </w:tc>
         <w:tc>
@@ -831,7 +1224,40 @@
     </w:p>
     <w:p>
       <w:r>
-        <w:t>De doorgegeven sensordata klopt in verhouding tot de positie van de sensor, en het nulpunt word correct gereset met een interval van 30 seconden.</w:t>
+        <w:t xml:space="preserve">De sensorlezingen hebben maximaal </w:t>
+      </w:r>
+      <w:r>
+        <w:rPr>
+          <w:highlight w:val="yellow"/>
+        </w:rPr>
+        <w:t>10</w:t>
+      </w:r>
+      <w:r>
+        <w:t xml:space="preserve"> graden</w:t>
+      </w:r>
+      <w:r>
+        <w:t>, en het nulpunt</w:t>
+      </w:r>
+      <w:r>
+        <w:t xml:space="preserve"> </w:t>
+      </w:r>
+      <w:r>
+        <w:t>(</w:t>
+      </w:r>
+      <w:r>
+        <w:t>waterpas</w:t>
+      </w:r>
+      <w:r>
+        <w:t>)</w:t>
+      </w:r>
+      <w:r>
+        <w:t xml:space="preserve"> word</w:t>
+      </w:r>
+      <w:r>
+        <w:t>t</w:t>
+      </w:r>
+      <w:r>
+        <w:t xml:space="preserve"> correct gereset met een interval van 30 seconden.</w:t>
       </w:r>
     </w:p>
     <w:p>
@@ -859,7 +1285,10 @@
           </w:tcPr>
           <w:p>
             <w:r>
-              <w:t>Test nr.</w:t>
+              <w:t>Test</w:t>
+            </w:r>
+            <w:r>
+              <w:t xml:space="preserve"> nr.</w:t>
             </w:r>
           </w:p>
         </w:tc>
@@ -926,6 +1355,7 @@
       <w:pPr>
         <w:pStyle w:val="Heading1"/>
       </w:pPr>
+      <w:bookmarkStart w:id="2" w:name="_Toc217033198"/>
       <w:r>
         <w:lastRenderedPageBreak/>
         <w:t xml:space="preserve">Test 3: </w:t>
@@ -933,6 +1363,7 @@
       <w:r>
         <w:t>Update interface</w:t>
       </w:r>
+      <w:bookmarkEnd w:id="2"/>
     </w:p>
     <w:p>
       <w:pPr>
@@ -944,13 +1375,23 @@
     </w:p>
     <w:p>
       <w:r>
-        <w:t xml:space="preserve">Nadat de data afgelezen en verwerkt is, moet de gebruiker goed kunnen zien hoe de boerderij nu ligt. Dus, een interface in </w:t>
-      </w:r>
-      <w:proofErr w:type="spellStart"/>
-      <w:r>
-        <w:t>Unity</w:t>
-      </w:r>
-      <w:proofErr w:type="spellEnd"/>
+        <w:t>Nadat de data afgelezen en verwerkt is, moet de gebruiker goed kunnen zien hoe de boerderij nu ligt</w:t>
+      </w:r>
+      <w:r>
+        <w:t>, met gebruik</w:t>
+      </w:r>
+      <w:r>
+        <w:t xml:space="preserve"> een </w:t>
+      </w:r>
+      <w:r>
+        <w:t>User I</w:t>
+      </w:r>
+      <w:r>
+        <w:t>nterfac</w:t>
+      </w:r>
+      <w:r>
+        <w:t>e</w:t>
+      </w:r>
       <w:r>
         <w:t>.</w:t>
       </w:r>
@@ -1257,11 +1698,9 @@
             <w:r>
               <w:t xml:space="preserve">Test </w:t>
             </w:r>
-            <w:proofErr w:type="spellStart"/>
-            <w:r>
-              <w:t>nr</w:t>
-            </w:r>
-            <w:proofErr w:type="spellEnd"/>
+            <w:r>
+              <w:t>nr.</w:t>
+            </w:r>
           </w:p>
         </w:tc>
         <w:tc>
@@ -1419,6 +1858,7 @@
       <w:pPr>
         <w:pStyle w:val="Heading1"/>
       </w:pPr>
+      <w:bookmarkStart w:id="3" w:name="_Toc217033199"/>
       <w:r>
         <w:lastRenderedPageBreak/>
         <w:t xml:space="preserve">Test </w:t>
@@ -1442,6 +1882,7 @@
       <w:r>
         <w:t>Mosfets</w:t>
       </w:r>
+      <w:bookmarkEnd w:id="3"/>
       <w:proofErr w:type="spellEnd"/>
     </w:p>
     <w:p>
@@ -1454,15 +1895,16 @@
     </w:p>
     <w:p>
       <w:r>
-        <w:t xml:space="preserve">De waterpompen moeten gebruikt worden om de FF te stabiliseren, en deze gaan wij aansturen met behulp van </w:t>
-      </w:r>
-      <w:proofErr w:type="spellStart"/>
-      <w:r>
-        <w:t>mosfets</w:t>
-      </w:r>
-      <w:proofErr w:type="spellEnd"/>
-      <w:r>
-        <w:t>.</w:t>
+        <w:t>De waterpompen moeten gebruikt</w:t>
+      </w:r>
+      <w:r>
+        <w:t xml:space="preserve"> kunnen</w:t>
+      </w:r>
+      <w:r>
+        <w:t xml:space="preserve"> worden om </w:t>
+      </w:r>
+      <w:r>
+        <w:t>water te verplaatsen in ballasttanks.</w:t>
       </w:r>
     </w:p>
     <w:p>
@@ -1654,11 +2096,9 @@
             <w:r>
               <w:t xml:space="preserve">Test </w:t>
             </w:r>
-            <w:proofErr w:type="spellStart"/>
-            <w:r>
-              <w:t>nr</w:t>
-            </w:r>
-            <w:proofErr w:type="spellEnd"/>
+            <w:r>
+              <w:t>nr.</w:t>
+            </w:r>
           </w:p>
         </w:tc>
         <w:tc>
@@ -1805,6 +2245,7 @@
       <w:pPr>
         <w:pStyle w:val="Heading1"/>
       </w:pPr>
+      <w:bookmarkStart w:id="4" w:name="_Toc217033200"/>
       <w:r>
         <w:lastRenderedPageBreak/>
         <w:t xml:space="preserve">Test </w:t>
@@ -1818,6 +2259,7 @@
       <w:r>
         <w:t>Algoritme gebaseerd op sensordata</w:t>
       </w:r>
+      <w:bookmarkEnd w:id="4"/>
     </w:p>
     <w:p>
       <w:pPr>
@@ -1829,7 +2271,13 @@
     </w:p>
     <w:p>
       <w:r>
-        <w:t xml:space="preserve">Als de sensordata binnen is, moeten de pompen in beweging komen om de </w:t>
+        <w:t xml:space="preserve">Als de sensordata binnen is, </w:t>
+      </w:r>
+      <w:r>
+        <w:t xml:space="preserve">en een verandering is nodig, </w:t>
+      </w:r>
+      <w:r>
+        <w:t xml:space="preserve">moeten de pompen in beweging komen om de </w:t>
       </w:r>
       <w:proofErr w:type="spellStart"/>
       <w:r>
@@ -2038,11 +2486,9 @@
             <w:r>
               <w:t xml:space="preserve">Test </w:t>
             </w:r>
-            <w:proofErr w:type="spellStart"/>
-            <w:r>
-              <w:t>nr</w:t>
-            </w:r>
-            <w:proofErr w:type="spellEnd"/>
+            <w:r>
+              <w:t>nr.</w:t>
+            </w:r>
           </w:p>
         </w:tc>
         <w:tc>
@@ -2193,19 +2639,18 @@
       <w:pPr>
         <w:pStyle w:val="Heading1"/>
       </w:pPr>
+      <w:bookmarkStart w:id="5" w:name="_Toc217033201"/>
       <w:r>
         <w:lastRenderedPageBreak/>
         <w:t xml:space="preserve">Test </w:t>
       </w:r>
       <w:r>
-        <w:t>(</w:t>
-      </w:r>
-      <w:r>
         <w:t>6</w:t>
       </w:r>
       <w:r>
         <w:t xml:space="preserve"> : …</w:t>
       </w:r>
+      <w:bookmarkEnd w:id="5"/>
     </w:p>
     <w:p>
       <w:pPr>
@@ -2273,11 +2718,9 @@
             <w:r>
               <w:t xml:space="preserve">Test </w:t>
             </w:r>
-            <w:proofErr w:type="spellStart"/>
-            <w:r>
-              <w:t>nr</w:t>
-            </w:r>
-            <w:proofErr w:type="spellEnd"/>
+            <w:r>
+              <w:t>nr.</w:t>
+            </w:r>
           </w:p>
         </w:tc>
         <w:tc>
@@ -2408,12 +2851,14 @@
       <w:pPr>
         <w:pStyle w:val="Heading1"/>
       </w:pPr>
-      <w:bookmarkStart w:id="0" w:name="_Toc213669770"/>
+      <w:bookmarkStart w:id="6" w:name="_Toc213669770"/>
+      <w:bookmarkStart w:id="7" w:name="_Toc217033202"/>
       <w:r>
         <w:lastRenderedPageBreak/>
         <w:t>Changelog</w:t>
       </w:r>
-      <w:bookmarkEnd w:id="0"/>
+      <w:bookmarkEnd w:id="6"/>
+      <w:bookmarkEnd w:id="7"/>
     </w:p>
     <w:tbl>
       <w:tblPr>
@@ -2545,13 +2990,7 @@
               <w:rPr>
                 <w:lang w:val="nl-NL"/>
               </w:rPr>
-              <w:t xml:space="preserve">Bestand aangemaakt met eerste </w:t>
-            </w:r>
-            <w:r>
-              <w:rPr>
-                <w:lang w:val="nl-NL"/>
-              </w:rPr>
-              <w:t>tests</w:t>
+              <w:t>Bestand aangemaakt met eerste tests</w:t>
             </w:r>
           </w:p>
         </w:tc>
@@ -4540,6 +4979,62 @@
       </w:tcPr>
     </w:tblStylePr>
   </w:style>
+  <w:style w:type="paragraph" w:styleId="TOCHeading">
+    <w:name w:val="TOC Heading"/>
+    <w:basedOn w:val="Heading1"/>
+    <w:next w:val="Normal"/>
+    <w:uiPriority w:val="39"/>
+    <w:unhideWhenUsed/>
+    <w:qFormat/>
+    <w:rsid w:val="007D75B9"/>
+    <w:pPr>
+      <w:spacing w:before="240" w:after="0"/>
+      <w:outlineLvl w:val="9"/>
+    </w:pPr>
+    <w:rPr>
+      <w:kern w:val="0"/>
+      <w:sz w:val="32"/>
+      <w:szCs w:val="32"/>
+      <w:lang w:val="en-US"/>
+      <w14:ligatures w14:val="none"/>
+    </w:rPr>
+  </w:style>
+  <w:style w:type="paragraph" w:styleId="TOC1">
+    <w:name w:val="toc 1"/>
+    <w:basedOn w:val="Normal"/>
+    <w:next w:val="Normal"/>
+    <w:autoRedefine/>
+    <w:uiPriority w:val="39"/>
+    <w:unhideWhenUsed/>
+    <w:rsid w:val="007D75B9"/>
+    <w:pPr>
+      <w:spacing w:after="100"/>
+    </w:pPr>
+  </w:style>
+  <w:style w:type="paragraph" w:styleId="TOC2">
+    <w:name w:val="toc 2"/>
+    <w:basedOn w:val="Normal"/>
+    <w:next w:val="Normal"/>
+    <w:autoRedefine/>
+    <w:uiPriority w:val="39"/>
+    <w:unhideWhenUsed/>
+    <w:rsid w:val="007D75B9"/>
+    <w:pPr>
+      <w:spacing w:after="100"/>
+      <w:ind w:left="220"/>
+    </w:pPr>
+  </w:style>
+  <w:style w:type="character" w:styleId="Hyperlink">
+    <w:name w:val="Hyperlink"/>
+    <w:basedOn w:val="DefaultParagraphFont"/>
+    <w:uiPriority w:val="99"/>
+    <w:unhideWhenUsed/>
+    <w:rsid w:val="007D75B9"/>
+    <w:rPr>
+      <w:color w:val="467886" w:themeColor="hyperlink"/>
+      <w:u w:val="single"/>
+    </w:rPr>
+  </w:style>
 </w:styles>
 </file>
 

</xml_diff>

<commit_message>
nieuwe test + invulling 1e uitvoering
</commit_message>
<xml_diff>
--- a/Opleverset/Documentatie/Testplan.docx
+++ b/Opleverset/Documentatie/Testplan.docx
@@ -2648,9 +2648,12 @@
         <w:t>6</w:t>
       </w:r>
       <w:r>
-        <w:t xml:space="preserve"> : …</w:t>
+        <w:t xml:space="preserve"> : </w:t>
       </w:r>
       <w:bookmarkEnd w:id="5"/>
+      <w:r>
+        <w:t>Waterdichtheid van de ballasttanks</w:t>
+      </w:r>
     </w:p>
     <w:p>
       <w:pPr>
@@ -2662,7 +2665,7 @@
     </w:p>
     <w:p>
       <w:r>
-        <w:t>(Neem de lezer mee in de context van de test, leg uit waarom deze test gedaan word)</w:t>
+        <w:t xml:space="preserve">De ballasttanks moeten waterdicht zijn.  </w:t>
       </w:r>
     </w:p>
     <w:p>
@@ -2675,7 +2678,63 @@
     </w:p>
     <w:p>
       <w:r>
-        <w:t>(Gedetailleerde en precieze instructies als tot hoe te test opgezet moet worden, en wat ervoor nodig is)</w:t>
+        <w:t>Benodigdheden</w:t>
+      </w:r>
+    </w:p>
+    <w:p>
+      <w:pPr>
+        <w:pStyle w:val="ListParagraph"/>
+        <w:numPr>
+          <w:ilvl w:val="0"/>
+          <w:numId w:val="5"/>
+        </w:numPr>
+      </w:pPr>
+      <w:r>
+        <w:t xml:space="preserve">Schaalmodel van de </w:t>
+      </w:r>
+      <w:proofErr w:type="spellStart"/>
+      <w:r>
+        <w:t>floating</w:t>
+      </w:r>
+      <w:proofErr w:type="spellEnd"/>
+      <w:r>
+        <w:t xml:space="preserve"> farm met 4 waterdichte ballasttanks</w:t>
+      </w:r>
+    </w:p>
+    <w:p>
+      <w:pPr>
+        <w:pStyle w:val="ListParagraph"/>
+        <w:numPr>
+          <w:ilvl w:val="0"/>
+          <w:numId w:val="5"/>
+        </w:numPr>
+      </w:pPr>
+      <w:r>
+        <w:t>1 liter water</w:t>
+      </w:r>
+    </w:p>
+    <w:p>
+      <w:pPr>
+        <w:pStyle w:val="ListParagraph"/>
+        <w:numPr>
+          <w:ilvl w:val="0"/>
+          <w:numId w:val="5"/>
+        </w:numPr>
+      </w:pPr>
+      <w:r>
+        <w:t>Timer</w:t>
+      </w:r>
+    </w:p>
+    <w:p>
+      <w:pPr>
+        <w:pStyle w:val="ListParagraph"/>
+        <w:numPr>
+          <w:ilvl w:val="0"/>
+          <w:numId w:val="5"/>
+        </w:numPr>
+      </w:pPr>
+      <w:r>
+        <w:t xml:space="preserve">Een waterdichte bak (bijv. plastic) van minstens 35L x 35B x 15H cm </w:t>
       </w:r>
     </w:p>
     <w:p>
@@ -2687,8 +2746,54 @@
       </w:r>
     </w:p>
     <w:p>
-      <w:r>
-        <w:t>(Duidelijke instructies als tot wel handelingen er nodig zijn voor het uitvoeren van de test, voorkeurig met een stappenplan)</w:t>
+      <w:pPr>
+        <w:pStyle w:val="ListParagraph"/>
+        <w:numPr>
+          <w:ilvl w:val="0"/>
+          <w:numId w:val="12"/>
+        </w:numPr>
+      </w:pPr>
+      <w:r>
+        <w:t>Zet het schaalmodel in de bak</w:t>
+      </w:r>
+    </w:p>
+    <w:p>
+      <w:pPr>
+        <w:pStyle w:val="ListParagraph"/>
+        <w:numPr>
+          <w:ilvl w:val="0"/>
+          <w:numId w:val="12"/>
+        </w:numPr>
+      </w:pPr>
+      <w:r>
+        <w:t xml:space="preserve">Vul de ballasttanks </w:t>
+      </w:r>
+      <w:r>
+        <w:t>tot 2 cm van de rand</w:t>
+      </w:r>
+    </w:p>
+    <w:p>
+      <w:pPr>
+        <w:pStyle w:val="ListParagraph"/>
+        <w:numPr>
+          <w:ilvl w:val="0"/>
+          <w:numId w:val="12"/>
+        </w:numPr>
+      </w:pPr>
+      <w:r>
+        <w:t>Laat staan voor 10 minuten</w:t>
+      </w:r>
+    </w:p>
+    <w:p>
+      <w:pPr>
+        <w:pStyle w:val="ListParagraph"/>
+        <w:numPr>
+          <w:ilvl w:val="0"/>
+          <w:numId w:val="12"/>
+        </w:numPr>
+      </w:pPr>
+      <w:r>
+        <w:t>Legen &amp; gebruikte materialen inspecteren voor vochtigheid</w:t>
       </w:r>
     </w:p>
     <w:p>
@@ -2749,7 +2854,11 @@
           <w:tcPr>
             <w:tcW w:w="7807" w:type="dxa"/>
           </w:tcPr>
-          <w:p/>
+          <w:p>
+            <w:r>
+              <w:t xml:space="preserve">De ballasttanks houden al het water binnen zonder te lekken. </w:t>
+            </w:r>
+          </w:p>
         </w:tc>
       </w:tr>
     </w:tbl>
@@ -2763,7 +2872,10 @@
     </w:p>
     <w:p>
       <w:r>
-        <w:t>(Wanneer is de test voldaan? Wanneer werkt het tot behoren? Weer duidelijk, zorg dat de gebruiker/tester geen verdere vragen meer kan stellen.)</w:t>
+        <w:t>De ballasttank kan voor 10 minuten water in de inhoud hebben zonder te lekken.</w:t>
+      </w:r>
+      <w:r>
+        <w:t xml:space="preserve"> Het hout onder de bedekking moet na de tijdsperiode van 10 minuten droog zijn. </w:t>
       </w:r>
     </w:p>
     <w:p>
@@ -2823,7 +2935,10 @@
           </w:tcPr>
           <w:p>
             <w:r>
-              <w:t>-</w:t>
+              <w:t xml:space="preserve">Lek in </w:t>
+            </w:r>
+            <w:r>
+              <w:t>2 ballasttanks</w:t>
             </w:r>
           </w:p>
         </w:tc>
@@ -3069,6 +3184,95 @@
 <file path=word/numbering.xml><?xml version="1.0" encoding="utf-8"?>
 <w:numbering xmlns:wpc="http://schemas.microsoft.com/office/word/2010/wordprocessingCanvas" xmlns:cx="http://schemas.microsoft.com/office/drawing/2014/chartex" xmlns:cx1="http://schemas.microsoft.com/office/drawing/2015/9/8/chartex" xmlns:cx2="http://schemas.microsoft.com/office/drawing/2015/10/21/chartex" xmlns:cx3="http://schemas.microsoft.com/office/drawing/2016/5/9/chartex" xmlns:cx4="http://schemas.microsoft.com/office/drawing/2016/5/10/chartex" xmlns:cx5="http://schemas.microsoft.com/office/drawing/2016/5/11/chartex" xmlns:cx6="http://schemas.microsoft.com/office/drawing/2016/5/12/chartex" xmlns:cx7="http://schemas.microsoft.com/office/drawing/2016/5/13/chartex" xmlns:cx8="http://schemas.microsoft.com/office/drawing/2016/5/14/chartex" xmlns:mc="http://schemas.openxmlformats.org/markup-compatibility/2006" xmlns:aink="http://schemas.microsoft.com/office/drawing/2016/ink" xmlns:am3d="http://schemas.microsoft.com/office/drawing/2017/model3d" xmlns:o="urn:schemas-microsoft-com:office:office" xmlns:oel="http://schemas.microsoft.com/office/2019/extlst" xmlns:r="http://schemas.openxmlformats.org/officeDocument/2006/relationships" xmlns:m="http://schemas.openxmlformats.org/officeDocument/2006/math" xmlns:v="urn:schemas-microsoft-com:vml" xmlns:wp14="http://schemas.microsoft.com/office/word/2010/wordprocessingDrawing" xmlns:wp="http://schemas.openxmlformats.org/drawingml/2006/wordprocessingDrawing" xmlns:w10="urn:schemas-microsoft-com:office:word" xmlns:w="http://schemas.openxmlformats.org/wordprocessingml/2006/main" xmlns:w14="http://schemas.microsoft.com/office/word/2010/wordml" xmlns:w15="http://schemas.microsoft.com/office/word/2012/wordml" xmlns:w16cex="http://schemas.microsoft.com/office/word/2018/wordml/cex" xmlns:w16cid="http://schemas.microsoft.com/office/word/2016/wordml/cid" xmlns:w16="http://schemas.microsoft.com/office/word/2018/wordml" xmlns:w16du="http://schemas.microsoft.com/office/word/2023/wordml/word16du" xmlns:w16sdtdh="http://schemas.microsoft.com/office/word/2020/wordml/sdtdatahash" xmlns:w16sdtfl="http://schemas.microsoft.com/office/word/2024/wordml/sdtformatlock" xmlns:w16se="http://schemas.microsoft.com/office/word/2015/wordml/symex" xmlns:wpg="http://schemas.microsoft.com/office/word/2010/wordprocessingGroup" xmlns:wpi="http://schemas.microsoft.com/office/word/2010/wordprocessingInk" xmlns:wne="http://schemas.microsoft.com/office/word/2006/wordml" xmlns:wps="http://schemas.microsoft.com/office/word/2010/wordprocessingShape" mc:Ignorable="w14 w15 w16se w16cid w16 w16cex w16sdtdh w16sdtfl w16du wp14">
   <w:abstractNum w:abstractNumId="0" w15:restartNumberingAfterBreak="0">
+    <w:nsid w:val="0CA54D44"/>
+    <w:multiLevelType w:val="hybridMultilevel"/>
+    <w:tmpl w:val="9CF0202A"/>
+    <w:lvl w:ilvl="0" w:tplc="58E2462C">
+      <w:start w:val="1"/>
+      <w:numFmt w:val="decimal"/>
+      <w:lvlText w:val="%1."/>
+      <w:lvlJc w:val="left"/>
+      <w:pPr>
+        <w:ind w:left="1080" w:hanging="360"/>
+      </w:pPr>
+      <w:rPr>
+        <w:rFonts w:hint="default"/>
+      </w:rPr>
+    </w:lvl>
+    <w:lvl w:ilvl="1" w:tplc="04130019" w:tentative="1">
+      <w:start w:val="1"/>
+      <w:numFmt w:val="lowerLetter"/>
+      <w:lvlText w:val="%2."/>
+      <w:lvlJc w:val="left"/>
+      <w:pPr>
+        <w:ind w:left="1800" w:hanging="360"/>
+      </w:pPr>
+    </w:lvl>
+    <w:lvl w:ilvl="2" w:tplc="0413001B" w:tentative="1">
+      <w:start w:val="1"/>
+      <w:numFmt w:val="lowerRoman"/>
+      <w:lvlText w:val="%3."/>
+      <w:lvlJc w:val="right"/>
+      <w:pPr>
+        <w:ind w:left="2520" w:hanging="180"/>
+      </w:pPr>
+    </w:lvl>
+    <w:lvl w:ilvl="3" w:tplc="0413000F" w:tentative="1">
+      <w:start w:val="1"/>
+      <w:numFmt w:val="decimal"/>
+      <w:lvlText w:val="%4."/>
+      <w:lvlJc w:val="left"/>
+      <w:pPr>
+        <w:ind w:left="3240" w:hanging="360"/>
+      </w:pPr>
+    </w:lvl>
+    <w:lvl w:ilvl="4" w:tplc="04130019" w:tentative="1">
+      <w:start w:val="1"/>
+      <w:numFmt w:val="lowerLetter"/>
+      <w:lvlText w:val="%5."/>
+      <w:lvlJc w:val="left"/>
+      <w:pPr>
+        <w:ind w:left="3960" w:hanging="360"/>
+      </w:pPr>
+    </w:lvl>
+    <w:lvl w:ilvl="5" w:tplc="0413001B" w:tentative="1">
+      <w:start w:val="1"/>
+      <w:numFmt w:val="lowerRoman"/>
+      <w:lvlText w:val="%6."/>
+      <w:lvlJc w:val="right"/>
+      <w:pPr>
+        <w:ind w:left="4680" w:hanging="180"/>
+      </w:pPr>
+    </w:lvl>
+    <w:lvl w:ilvl="6" w:tplc="0413000F" w:tentative="1">
+      <w:start w:val="1"/>
+      <w:numFmt w:val="decimal"/>
+      <w:lvlText w:val="%7."/>
+      <w:lvlJc w:val="left"/>
+      <w:pPr>
+        <w:ind w:left="5400" w:hanging="360"/>
+      </w:pPr>
+    </w:lvl>
+    <w:lvl w:ilvl="7" w:tplc="04130019" w:tentative="1">
+      <w:start w:val="1"/>
+      <w:numFmt w:val="lowerLetter"/>
+      <w:lvlText w:val="%8."/>
+      <w:lvlJc w:val="left"/>
+      <w:pPr>
+        <w:ind w:left="6120" w:hanging="360"/>
+      </w:pPr>
+    </w:lvl>
+    <w:lvl w:ilvl="8" w:tplc="0413001B" w:tentative="1">
+      <w:start w:val="1"/>
+      <w:numFmt w:val="lowerRoman"/>
+      <w:lvlText w:val="%9."/>
+      <w:lvlJc w:val="right"/>
+      <w:pPr>
+        <w:ind w:left="6840" w:hanging="180"/>
+      </w:pPr>
+    </w:lvl>
+  </w:abstractNum>
+  <w:abstractNum w:abstractNumId="1" w15:restartNumberingAfterBreak="0">
     <w:nsid w:val="0DC20623"/>
     <w:multiLevelType w:val="hybridMultilevel"/>
     <w:tmpl w:val="F6E43080"/>
@@ -3181,7 +3385,7 @@
       </w:rPr>
     </w:lvl>
   </w:abstractNum>
-  <w:abstractNum w:abstractNumId="1" w15:restartNumberingAfterBreak="0">
+  <w:abstractNum w:abstractNumId="2" w15:restartNumberingAfterBreak="0">
     <w:nsid w:val="12F62B76"/>
     <w:multiLevelType w:val="hybridMultilevel"/>
     <w:tmpl w:val="C45A5452"/>
@@ -3270,7 +3474,7 @@
       </w:pPr>
     </w:lvl>
   </w:abstractNum>
-  <w:abstractNum w:abstractNumId="2" w15:restartNumberingAfterBreak="0">
+  <w:abstractNum w:abstractNumId="3" w15:restartNumberingAfterBreak="0">
     <w:nsid w:val="194F226B"/>
     <w:multiLevelType w:val="hybridMultilevel"/>
     <w:tmpl w:val="9006A23C"/>
@@ -3359,7 +3563,7 @@
       </w:pPr>
     </w:lvl>
   </w:abstractNum>
-  <w:abstractNum w:abstractNumId="3" w15:restartNumberingAfterBreak="0">
+  <w:abstractNum w:abstractNumId="4" w15:restartNumberingAfterBreak="0">
     <w:nsid w:val="1FB176C1"/>
     <w:multiLevelType w:val="hybridMultilevel"/>
     <w:tmpl w:val="606C77A0"/>
@@ -3471,7 +3675,185 @@
       </w:rPr>
     </w:lvl>
   </w:abstractNum>
-  <w:abstractNum w:abstractNumId="4" w15:restartNumberingAfterBreak="0">
+  <w:abstractNum w:abstractNumId="5" w15:restartNumberingAfterBreak="0">
+    <w:nsid w:val="24FB64EA"/>
+    <w:multiLevelType w:val="hybridMultilevel"/>
+    <w:tmpl w:val="0A5830BA"/>
+    <w:lvl w:ilvl="0" w:tplc="0413000F">
+      <w:start w:val="1"/>
+      <w:numFmt w:val="decimal"/>
+      <w:lvlText w:val="%1."/>
+      <w:lvlJc w:val="left"/>
+      <w:pPr>
+        <w:ind w:left="720" w:hanging="360"/>
+      </w:pPr>
+      <w:rPr>
+        <w:rFonts w:hint="default"/>
+      </w:rPr>
+    </w:lvl>
+    <w:lvl w:ilvl="1" w:tplc="04130019" w:tentative="1">
+      <w:start w:val="1"/>
+      <w:numFmt w:val="lowerLetter"/>
+      <w:lvlText w:val="%2."/>
+      <w:lvlJc w:val="left"/>
+      <w:pPr>
+        <w:ind w:left="1440" w:hanging="360"/>
+      </w:pPr>
+    </w:lvl>
+    <w:lvl w:ilvl="2" w:tplc="0413001B" w:tentative="1">
+      <w:start w:val="1"/>
+      <w:numFmt w:val="lowerRoman"/>
+      <w:lvlText w:val="%3."/>
+      <w:lvlJc w:val="right"/>
+      <w:pPr>
+        <w:ind w:left="2160" w:hanging="180"/>
+      </w:pPr>
+    </w:lvl>
+    <w:lvl w:ilvl="3" w:tplc="0413000F" w:tentative="1">
+      <w:start w:val="1"/>
+      <w:numFmt w:val="decimal"/>
+      <w:lvlText w:val="%4."/>
+      <w:lvlJc w:val="left"/>
+      <w:pPr>
+        <w:ind w:left="2880" w:hanging="360"/>
+      </w:pPr>
+    </w:lvl>
+    <w:lvl w:ilvl="4" w:tplc="04130019" w:tentative="1">
+      <w:start w:val="1"/>
+      <w:numFmt w:val="lowerLetter"/>
+      <w:lvlText w:val="%5."/>
+      <w:lvlJc w:val="left"/>
+      <w:pPr>
+        <w:ind w:left="3600" w:hanging="360"/>
+      </w:pPr>
+    </w:lvl>
+    <w:lvl w:ilvl="5" w:tplc="0413001B" w:tentative="1">
+      <w:start w:val="1"/>
+      <w:numFmt w:val="lowerRoman"/>
+      <w:lvlText w:val="%6."/>
+      <w:lvlJc w:val="right"/>
+      <w:pPr>
+        <w:ind w:left="4320" w:hanging="180"/>
+      </w:pPr>
+    </w:lvl>
+    <w:lvl w:ilvl="6" w:tplc="0413000F" w:tentative="1">
+      <w:start w:val="1"/>
+      <w:numFmt w:val="decimal"/>
+      <w:lvlText w:val="%7."/>
+      <w:lvlJc w:val="left"/>
+      <w:pPr>
+        <w:ind w:left="5040" w:hanging="360"/>
+      </w:pPr>
+    </w:lvl>
+    <w:lvl w:ilvl="7" w:tplc="04130019" w:tentative="1">
+      <w:start w:val="1"/>
+      <w:numFmt w:val="lowerLetter"/>
+      <w:lvlText w:val="%8."/>
+      <w:lvlJc w:val="left"/>
+      <w:pPr>
+        <w:ind w:left="5760" w:hanging="360"/>
+      </w:pPr>
+    </w:lvl>
+    <w:lvl w:ilvl="8" w:tplc="0413001B" w:tentative="1">
+      <w:start w:val="1"/>
+      <w:numFmt w:val="lowerRoman"/>
+      <w:lvlText w:val="%9."/>
+      <w:lvlJc w:val="right"/>
+      <w:pPr>
+        <w:ind w:left="6480" w:hanging="180"/>
+      </w:pPr>
+    </w:lvl>
+  </w:abstractNum>
+  <w:abstractNum w:abstractNumId="6" w15:restartNumberingAfterBreak="0">
+    <w:nsid w:val="2F947B95"/>
+    <w:multiLevelType w:val="hybridMultilevel"/>
+    <w:tmpl w:val="EFE26554"/>
+    <w:lvl w:ilvl="0" w:tplc="0413000F">
+      <w:start w:val="1"/>
+      <w:numFmt w:val="decimal"/>
+      <w:lvlText w:val="%1."/>
+      <w:lvlJc w:val="left"/>
+      <w:pPr>
+        <w:ind w:left="720" w:hanging="360"/>
+      </w:pPr>
+      <w:rPr>
+        <w:rFonts w:hint="default"/>
+      </w:rPr>
+    </w:lvl>
+    <w:lvl w:ilvl="1" w:tplc="04130019" w:tentative="1">
+      <w:start w:val="1"/>
+      <w:numFmt w:val="lowerLetter"/>
+      <w:lvlText w:val="%2."/>
+      <w:lvlJc w:val="left"/>
+      <w:pPr>
+        <w:ind w:left="1440" w:hanging="360"/>
+      </w:pPr>
+    </w:lvl>
+    <w:lvl w:ilvl="2" w:tplc="0413001B" w:tentative="1">
+      <w:start w:val="1"/>
+      <w:numFmt w:val="lowerRoman"/>
+      <w:lvlText w:val="%3."/>
+      <w:lvlJc w:val="right"/>
+      <w:pPr>
+        <w:ind w:left="2160" w:hanging="180"/>
+      </w:pPr>
+    </w:lvl>
+    <w:lvl w:ilvl="3" w:tplc="0413000F" w:tentative="1">
+      <w:start w:val="1"/>
+      <w:numFmt w:val="decimal"/>
+      <w:lvlText w:val="%4."/>
+      <w:lvlJc w:val="left"/>
+      <w:pPr>
+        <w:ind w:left="2880" w:hanging="360"/>
+      </w:pPr>
+    </w:lvl>
+    <w:lvl w:ilvl="4" w:tplc="04130019" w:tentative="1">
+      <w:start w:val="1"/>
+      <w:numFmt w:val="lowerLetter"/>
+      <w:lvlText w:val="%5."/>
+      <w:lvlJc w:val="left"/>
+      <w:pPr>
+        <w:ind w:left="3600" w:hanging="360"/>
+      </w:pPr>
+    </w:lvl>
+    <w:lvl w:ilvl="5" w:tplc="0413001B" w:tentative="1">
+      <w:start w:val="1"/>
+      <w:numFmt w:val="lowerRoman"/>
+      <w:lvlText w:val="%6."/>
+      <w:lvlJc w:val="right"/>
+      <w:pPr>
+        <w:ind w:left="4320" w:hanging="180"/>
+      </w:pPr>
+    </w:lvl>
+    <w:lvl w:ilvl="6" w:tplc="0413000F" w:tentative="1">
+      <w:start w:val="1"/>
+      <w:numFmt w:val="decimal"/>
+      <w:lvlText w:val="%7."/>
+      <w:lvlJc w:val="left"/>
+      <w:pPr>
+        <w:ind w:left="5040" w:hanging="360"/>
+      </w:pPr>
+    </w:lvl>
+    <w:lvl w:ilvl="7" w:tplc="04130019" w:tentative="1">
+      <w:start w:val="1"/>
+      <w:numFmt w:val="lowerLetter"/>
+      <w:lvlText w:val="%8."/>
+      <w:lvlJc w:val="left"/>
+      <w:pPr>
+        <w:ind w:left="5760" w:hanging="360"/>
+      </w:pPr>
+    </w:lvl>
+    <w:lvl w:ilvl="8" w:tplc="0413001B" w:tentative="1">
+      <w:start w:val="1"/>
+      <w:numFmt w:val="lowerRoman"/>
+      <w:lvlText w:val="%9."/>
+      <w:lvlJc w:val="right"/>
+      <w:pPr>
+        <w:ind w:left="6480" w:hanging="180"/>
+      </w:pPr>
+    </w:lvl>
+  </w:abstractNum>
+  <w:abstractNum w:abstractNumId="7" w15:restartNumberingAfterBreak="0">
     <w:nsid w:val="3B3D62BF"/>
     <w:multiLevelType w:val="hybridMultilevel"/>
     <w:tmpl w:val="4154C13A"/>
@@ -3560,7 +3942,7 @@
       </w:pPr>
     </w:lvl>
   </w:abstractNum>
-  <w:abstractNum w:abstractNumId="5" w15:restartNumberingAfterBreak="0">
+  <w:abstractNum w:abstractNumId="8" w15:restartNumberingAfterBreak="0">
     <w:nsid w:val="488B3E90"/>
     <w:multiLevelType w:val="hybridMultilevel"/>
     <w:tmpl w:val="07F0D7CC"/>
@@ -3649,7 +4031,7 @@
       </w:pPr>
     </w:lvl>
   </w:abstractNum>
-  <w:abstractNum w:abstractNumId="6" w15:restartNumberingAfterBreak="0">
+  <w:abstractNum w:abstractNumId="9" w15:restartNumberingAfterBreak="0">
     <w:nsid w:val="4B6063B7"/>
     <w:multiLevelType w:val="hybridMultilevel"/>
     <w:tmpl w:val="9A288172"/>
@@ -3738,7 +4120,7 @@
       </w:pPr>
     </w:lvl>
   </w:abstractNum>
-  <w:abstractNum w:abstractNumId="7" w15:restartNumberingAfterBreak="0">
+  <w:abstractNum w:abstractNumId="10" w15:restartNumberingAfterBreak="0">
     <w:nsid w:val="6B2A7F25"/>
     <w:multiLevelType w:val="hybridMultilevel"/>
     <w:tmpl w:val="DE3AD8D4"/>
@@ -3850,7 +4232,7 @@
       </w:rPr>
     </w:lvl>
   </w:abstractNum>
-  <w:abstractNum w:abstractNumId="8" w15:restartNumberingAfterBreak="0">
+  <w:abstractNum w:abstractNumId="11" w15:restartNumberingAfterBreak="0">
     <w:nsid w:val="776649B2"/>
     <w:multiLevelType w:val="hybridMultilevel"/>
     <w:tmpl w:val="4154C13A"/>
@@ -3940,31 +4322,40 @@
     </w:lvl>
   </w:abstractNum>
   <w:num w:numId="1" w16cid:durableId="770783608">
+    <w:abstractNumId w:val="10"/>
+  </w:num>
+  <w:num w:numId="2" w16cid:durableId="1905070113">
+    <w:abstractNumId w:val="2"/>
+  </w:num>
+  <w:num w:numId="3" w16cid:durableId="896472558">
+    <w:abstractNumId w:val="8"/>
+  </w:num>
+  <w:num w:numId="4" w16cid:durableId="588734986">
+    <w:abstractNumId w:val="1"/>
+  </w:num>
+  <w:num w:numId="5" w16cid:durableId="1044646153">
+    <w:abstractNumId w:val="4"/>
+  </w:num>
+  <w:num w:numId="6" w16cid:durableId="571895215">
+    <w:abstractNumId w:val="11"/>
+  </w:num>
+  <w:num w:numId="7" w16cid:durableId="1926769116">
     <w:abstractNumId w:val="7"/>
   </w:num>
-  <w:num w:numId="2" w16cid:durableId="1905070113">
-    <w:abstractNumId w:val="1"/>
+  <w:num w:numId="8" w16cid:durableId="937297394">
+    <w:abstractNumId w:val="9"/>
   </w:num>
-  <w:num w:numId="3" w16cid:durableId="896472558">
-    <w:abstractNumId w:val="5"/>
+  <w:num w:numId="9" w16cid:durableId="496117487">
+    <w:abstractNumId w:val="3"/>
   </w:num>
-  <w:num w:numId="4" w16cid:durableId="588734986">
+  <w:num w:numId="10" w16cid:durableId="667291691">
+    <w:abstractNumId w:val="6"/>
+  </w:num>
+  <w:num w:numId="11" w16cid:durableId="4282938">
     <w:abstractNumId w:val="0"/>
   </w:num>
-  <w:num w:numId="5" w16cid:durableId="1044646153">
-    <w:abstractNumId w:val="3"/>
-  </w:num>
-  <w:num w:numId="6" w16cid:durableId="571895215">
-    <w:abstractNumId w:val="8"/>
-  </w:num>
-  <w:num w:numId="7" w16cid:durableId="1926769116">
-    <w:abstractNumId w:val="4"/>
-  </w:num>
-  <w:num w:numId="8" w16cid:durableId="937297394">
-    <w:abstractNumId w:val="6"/>
-  </w:num>
-  <w:num w:numId="9" w16cid:durableId="496117487">
-    <w:abstractNumId w:val="2"/>
+  <w:num w:numId="12" w16cid:durableId="1123420533">
+    <w:abstractNumId w:val="5"/>
   </w:num>
 </w:numbering>
 </file>

</xml_diff>

<commit_message>
presentatie sprint 6 + testplan
</commit_message>
<xml_diff>
--- a/Opleverset/Documentatie/Testplan.docx
+++ b/Opleverset/Documentatie/Testplan.docx
@@ -668,15 +668,7 @@
       </w:r>
       <w:r>
         <w:br/>
-        <w:t xml:space="preserve">- </w:t>
-      </w:r>
-      <w:proofErr w:type="spellStart"/>
-      <w:r>
-        <w:t>Floating</w:t>
-      </w:r>
-      <w:proofErr w:type="spellEnd"/>
-      <w:r>
-        <w:t xml:space="preserve"> Farm schaalmodel (zonder elektronica) (</w:t>
+        <w:t>- Floating Farm schaalmodel (zonder elektronica) (</w:t>
       </w:r>
       <w:r>
         <w:rPr>
@@ -947,15 +939,7 @@
         <w:t xml:space="preserve"> het nulpunt </w:t>
       </w:r>
       <w:r>
-        <w:t xml:space="preserve">niet beïnvloed worden door de schommelingen van de </w:t>
-      </w:r>
-      <w:proofErr w:type="spellStart"/>
-      <w:r>
-        <w:t>Floating</w:t>
-      </w:r>
-      <w:proofErr w:type="spellEnd"/>
-      <w:r>
-        <w:t xml:space="preserve"> Farm en de eventuele verschillende startposities van de boerderij. </w:t>
+        <w:t xml:space="preserve">niet beïnvloed worden door de schommelingen van de Floating Farm en de eventuele verschillende startposities van de boerderij. </w:t>
       </w:r>
     </w:p>
     <w:p>
@@ -972,13 +956,8 @@
       </w:r>
       <w:r>
         <w:br/>
-        <w:t xml:space="preserve">- MPU-6050 </w:t>
-      </w:r>
-      <w:proofErr w:type="spellStart"/>
-      <w:r>
-        <w:t>accelerometer</w:t>
-      </w:r>
-      <w:proofErr w:type="spellEnd"/>
+        <w:t>- MPU-6050 accelerometer</w:t>
+      </w:r>
       <w:r>
         <w:br/>
         <w:t xml:space="preserve">- </w:t>
@@ -988,15 +967,7 @@
       </w:r>
       <w:r>
         <w:br/>
-        <w:t xml:space="preserve">- Laptop om code up te </w:t>
-      </w:r>
-      <w:proofErr w:type="spellStart"/>
-      <w:r>
-        <w:t>loaden</w:t>
-      </w:r>
-      <w:proofErr w:type="spellEnd"/>
-      <w:r>
-        <w:t xml:space="preserve"> en data binnen te krijgen</w:t>
+        <w:t>- Laptop om code up te loaden en data binnen te krijgen</w:t>
       </w:r>
       <w:r>
         <w:br/>
@@ -1006,35 +977,7 @@
         <w:rPr>
           <w:color w:val="00B0F0"/>
         </w:rPr>
-        <w:t>Project-5-6---</w:t>
-      </w:r>
-      <w:proofErr w:type="spellStart"/>
-      <w:r>
-        <w:rPr>
-          <w:color w:val="00B0F0"/>
-        </w:rPr>
-        <w:t>Floating</w:t>
-      </w:r>
-      <w:proofErr w:type="spellEnd"/>
-      <w:r>
-        <w:rPr>
-          <w:color w:val="00B0F0"/>
-        </w:rPr>
-        <w:t>-Farm\</w:t>
-      </w:r>
-      <w:proofErr w:type="spellStart"/>
-      <w:r>
-        <w:rPr>
-          <w:color w:val="00B0F0"/>
-        </w:rPr>
-        <w:t>Opleverset</w:t>
-      </w:r>
-      <w:proofErr w:type="spellEnd"/>
-      <w:r>
-        <w:rPr>
-          <w:color w:val="00B0F0"/>
-        </w:rPr>
-        <w:t>\Code\ESP32\</w:t>
+        <w:t>Project-5-6---Floating-Farm\Opleverset\Code\ESP32\</w:t>
       </w:r>
       <w:r>
         <w:rPr>
@@ -1047,15 +990,7 @@
       </w:r>
       <w:r>
         <w:br/>
-        <w:t xml:space="preserve">- </w:t>
-      </w:r>
-      <w:proofErr w:type="spellStart"/>
-      <w:r>
-        <w:t>MicroUSB</w:t>
-      </w:r>
-      <w:proofErr w:type="spellEnd"/>
-      <w:r>
-        <w:t xml:space="preserve"> naar USBA kabel</w:t>
+        <w:t>- MicroUSB naar USBA kabel</w:t>
       </w:r>
     </w:p>
     <w:p>
@@ -1087,15 +1022,7 @@
         </w:numPr>
       </w:pPr>
       <w:r>
-        <w:t xml:space="preserve">Sluit de ESP32 aan op de laptop met de </w:t>
-      </w:r>
-      <w:proofErr w:type="spellStart"/>
-      <w:r>
-        <w:t>MicroUSB</w:t>
-      </w:r>
-      <w:proofErr w:type="spellEnd"/>
-      <w:r>
-        <w:t xml:space="preserve"> naar USBA kabel.</w:t>
+        <w:t>Sluit de ESP32 aan op de laptop met de MicroUSB naar USBA kabel.</w:t>
       </w:r>
     </w:p>
     <w:p>
@@ -1107,13 +1034,8 @@
         </w:numPr>
       </w:pPr>
       <w:r>
-        <w:t xml:space="preserve">Open de verwezen code en download de benodigde </w:t>
-      </w:r>
-      <w:proofErr w:type="spellStart"/>
-      <w:r>
-        <w:t>libraries</w:t>
-      </w:r>
-      <w:proofErr w:type="spellEnd"/>
+        <w:t>Open de verwezen code en download de benodigde libraries</w:t>
+      </w:r>
     </w:p>
     <w:p>
       <w:pPr>
@@ -1124,15 +1046,7 @@
         </w:numPr>
       </w:pPr>
       <w:r>
-        <w:t>Upload de code naar de ESP32 en open de “</w:t>
-      </w:r>
-      <w:proofErr w:type="spellStart"/>
-      <w:r>
-        <w:t>Serial</w:t>
-      </w:r>
-      <w:proofErr w:type="spellEnd"/>
-      <w:r>
-        <w:t xml:space="preserve"> monitor”</w:t>
+        <w:t>Upload de code naar de ESP32 en open de “Serial monitor”</w:t>
       </w:r>
     </w:p>
     <w:p>
@@ -1410,15 +1324,7 @@
       </w:r>
       <w:r>
         <w:br/>
-        <w:t xml:space="preserve">- Laptop met een manier om code up te </w:t>
-      </w:r>
-      <w:proofErr w:type="spellStart"/>
-      <w:r>
-        <w:t>loaden</w:t>
-      </w:r>
-      <w:proofErr w:type="spellEnd"/>
-      <w:r>
-        <w:t xml:space="preserve"> naar de ESP32</w:t>
+        <w:t>- Laptop met een manier om code up te loaden naar de ESP32</w:t>
       </w:r>
       <w:r>
         <w:br/>
@@ -1427,67 +1333,18 @@
       <w:r>
         <w:t xml:space="preserve">bijv. </w:t>
       </w:r>
-      <w:proofErr w:type="spellStart"/>
-      <w:r>
-        <w:t>Arduino</w:t>
-      </w:r>
-      <w:proofErr w:type="spellEnd"/>
-      <w:r>
-        <w:t xml:space="preserve"> R3)</w:t>
+      <w:r>
+        <w:t>Arduino R3)</w:t>
       </w:r>
       <w:r>
         <w:br/>
-        <w:t xml:space="preserve">- </w:t>
-      </w:r>
-      <w:proofErr w:type="spellStart"/>
-      <w:r>
-        <w:t>Unity</w:t>
-      </w:r>
-      <w:proofErr w:type="spellEnd"/>
-      <w:r>
-        <w:t xml:space="preserve"> </w:t>
-      </w:r>
-      <w:proofErr w:type="spellStart"/>
-      <w:r>
-        <w:t>executable</w:t>
-      </w:r>
-      <w:proofErr w:type="spellEnd"/>
-      <w:r>
-        <w:t xml:space="preserve"> (zie </w:t>
+        <w:t xml:space="preserve">- Unity executable (zie </w:t>
       </w:r>
       <w:r>
         <w:rPr>
           <w:color w:val="00B0F0"/>
         </w:rPr>
-        <w:t>Project-5-6---</w:t>
-      </w:r>
-      <w:proofErr w:type="spellStart"/>
-      <w:r>
-        <w:rPr>
-          <w:color w:val="00B0F0"/>
-        </w:rPr>
-        <w:t>Floating</w:t>
-      </w:r>
-      <w:proofErr w:type="spellEnd"/>
-      <w:r>
-        <w:rPr>
-          <w:color w:val="00B0F0"/>
-        </w:rPr>
-        <w:t>-Farm\</w:t>
-      </w:r>
-      <w:proofErr w:type="spellStart"/>
-      <w:r>
-        <w:rPr>
-          <w:color w:val="00B0F0"/>
-        </w:rPr>
-        <w:t>Opleverset</w:t>
-      </w:r>
-      <w:proofErr w:type="spellEnd"/>
-      <w:r>
-        <w:rPr>
-          <w:color w:val="00B0F0"/>
-        </w:rPr>
-        <w:t>\Code\GUI</w:t>
+        <w:t>Project-5-6---Floating-Farm\Opleverset\Code\GUI</w:t>
       </w:r>
       <w:r>
         <w:rPr>
@@ -1512,35 +1369,7 @@
         <w:rPr>
           <w:color w:val="00B0F0"/>
         </w:rPr>
-        <w:t>Project-5-6---</w:t>
-      </w:r>
-      <w:proofErr w:type="spellStart"/>
-      <w:r>
-        <w:rPr>
-          <w:color w:val="00B0F0"/>
-        </w:rPr>
-        <w:t>Floating</w:t>
-      </w:r>
-      <w:proofErr w:type="spellEnd"/>
-      <w:r>
-        <w:rPr>
-          <w:color w:val="00B0F0"/>
-        </w:rPr>
-        <w:t>-Farm\</w:t>
-      </w:r>
-      <w:proofErr w:type="spellStart"/>
-      <w:r>
-        <w:rPr>
-          <w:color w:val="00B0F0"/>
-        </w:rPr>
-        <w:t>Opleverset</w:t>
-      </w:r>
-      <w:proofErr w:type="spellEnd"/>
-      <w:r>
-        <w:rPr>
-          <w:color w:val="00B0F0"/>
-        </w:rPr>
-        <w:t>\Code\ESP32</w:t>
+        <w:t>Project-5-6---Floating-Farm\Opleverset\Code\ESP32</w:t>
       </w:r>
       <w:r>
         <w:rPr>
@@ -1585,15 +1414,7 @@
         </w:numPr>
       </w:pPr>
       <w:r>
-        <w:t xml:space="preserve">Sluit de ESP32 aan op de laptop met de </w:t>
-      </w:r>
-      <w:proofErr w:type="spellStart"/>
-      <w:r>
-        <w:t>MicroUSB</w:t>
-      </w:r>
-      <w:proofErr w:type="spellEnd"/>
-      <w:r>
-        <w:t xml:space="preserve"> naar USBA kabel.</w:t>
+        <w:t>Sluit de ESP32 aan op de laptop met de MicroUSB naar USBA kabel.</w:t>
       </w:r>
     </w:p>
     <w:p>
@@ -1605,13 +1426,8 @@
         </w:numPr>
       </w:pPr>
       <w:r>
-        <w:t xml:space="preserve">Open de verwezen code en download de benodigde </w:t>
-      </w:r>
-      <w:proofErr w:type="spellStart"/>
-      <w:r>
-        <w:t>libraries</w:t>
-      </w:r>
-      <w:proofErr w:type="spellEnd"/>
+        <w:t>Open de verwezen code en download de benodigde libraries</w:t>
+      </w:r>
     </w:p>
     <w:p>
       <w:pPr>
@@ -1637,21 +1453,8 @@
         </w:numPr>
       </w:pPr>
       <w:r>
-        <w:t xml:space="preserve">Open de </w:t>
-      </w:r>
-      <w:proofErr w:type="spellStart"/>
-      <w:r>
-        <w:t>Unity</w:t>
-      </w:r>
-      <w:proofErr w:type="spellEnd"/>
-      <w:r>
-        <w:t xml:space="preserve"> </w:t>
-      </w:r>
-      <w:proofErr w:type="spellStart"/>
-      <w:r>
-        <w:t>executable</w:t>
-      </w:r>
-      <w:proofErr w:type="spellEnd"/>
+        <w:t>Open de Unity executable</w:t>
+      </w:r>
     </w:p>
     <w:p>
       <w:pPr>
@@ -1731,15 +1534,7 @@
           </w:tcPr>
           <w:p>
             <w:r>
-              <w:t xml:space="preserve">De </w:t>
-            </w:r>
-            <w:proofErr w:type="spellStart"/>
-            <w:r>
-              <w:t>Unity</w:t>
-            </w:r>
-            <w:proofErr w:type="spellEnd"/>
-            <w:r>
-              <w:t xml:space="preserve"> interface bootst te positie van de MPU-6050 na met behulp van een 3D model</w:t>
+              <w:t>De Unity interface bootst te positie van de MPU-6050 na met behulp van een 3D model</w:t>
             </w:r>
             <w:r>
               <w:t>.</w:t>
@@ -1762,15 +1557,7 @@
     </w:p>
     <w:p>
       <w:r>
-        <w:t xml:space="preserve">De </w:t>
-      </w:r>
-      <w:proofErr w:type="spellStart"/>
-      <w:r>
-        <w:t>Unity</w:t>
-      </w:r>
-      <w:proofErr w:type="spellEnd"/>
-      <w:r>
-        <w:t xml:space="preserve"> interface is accuraat in de</w:t>
+        <w:t>De Unity interface is accuraat in de</w:t>
       </w:r>
       <w:r>
         <w:t xml:space="preserve"> nabootsing en de positie komt overeen met de lezingen van de Accelerometer. Deze lezingen blijven accuraat voor op z’n minst 5 minuten met maximaal 3 graden afwijking.</w:t>
@@ -1876,14 +1663,9 @@
         <w:t xml:space="preserve"> </w:t>
       </w:r>
       <w:r>
-        <w:t xml:space="preserve">Aansturen van de waterpompen met </w:t>
-      </w:r>
-      <w:proofErr w:type="spellStart"/>
-      <w:r>
-        <w:t>Mosfets</w:t>
+        <w:t>Aansturen van de waterpompen met Mosfets</w:t>
       </w:r>
       <w:bookmarkEnd w:id="3"/>
-      <w:proofErr w:type="spellEnd"/>
     </w:p>
     <w:p>
       <w:pPr>
@@ -1921,27 +1703,11 @@
       </w:r>
       <w:r>
         <w:br/>
-        <w:t xml:space="preserve">- Laptop met een manier om code up te </w:t>
-      </w:r>
-      <w:proofErr w:type="spellStart"/>
-      <w:r>
-        <w:t>loaden</w:t>
-      </w:r>
-      <w:proofErr w:type="spellEnd"/>
-      <w:r>
-        <w:t xml:space="preserve"> naar de ESP32</w:t>
+        <w:t>- Laptop met een manier om code up te loaden naar de ESP32</w:t>
       </w:r>
       <w:r>
         <w:br/>
-        <w:t xml:space="preserve">- Een ESP32 of soortgelijke microcontroller (bijv. </w:t>
-      </w:r>
-      <w:proofErr w:type="spellStart"/>
-      <w:r>
-        <w:t>Arduino</w:t>
-      </w:r>
-      <w:proofErr w:type="spellEnd"/>
-      <w:r>
-        <w:t xml:space="preserve"> R3)</w:t>
+        <w:t>- Een ESP32 of soortgelijke microcontroller (bijv. Arduino R3)</w:t>
       </w:r>
       <w:r>
         <w:br/>
@@ -1951,35 +1717,7 @@
         <w:rPr>
           <w:color w:val="00B0F0"/>
         </w:rPr>
-        <w:t>Project-5-6---</w:t>
-      </w:r>
-      <w:proofErr w:type="spellStart"/>
-      <w:r>
-        <w:rPr>
-          <w:color w:val="00B0F0"/>
-        </w:rPr>
-        <w:t>Floating</w:t>
-      </w:r>
-      <w:proofErr w:type="spellEnd"/>
-      <w:r>
-        <w:rPr>
-          <w:color w:val="00B0F0"/>
-        </w:rPr>
-        <w:t>-Farm\</w:t>
-      </w:r>
-      <w:proofErr w:type="spellStart"/>
-      <w:r>
-        <w:rPr>
-          <w:color w:val="00B0F0"/>
-        </w:rPr>
-        <w:t>Opleverset</w:t>
-      </w:r>
-      <w:proofErr w:type="spellEnd"/>
-      <w:r>
-        <w:rPr>
-          <w:color w:val="00B0F0"/>
-        </w:rPr>
-        <w:t>\Code\ESP32</w:t>
+        <w:t>Project-5-6---Floating-Farm\Opleverset\Code\ESP32</w:t>
       </w:r>
       <w:r>
         <w:rPr>
@@ -2000,13 +1738,8 @@
       </w:r>
       <w:r>
         <w:br/>
-        <w:t xml:space="preserve">- 4 </w:t>
-      </w:r>
-      <w:proofErr w:type="spellStart"/>
-      <w:r>
-        <w:t>Mosfets</w:t>
-      </w:r>
-      <w:proofErr w:type="spellEnd"/>
+        <w:t>- 4 Mosfets</w:t>
+      </w:r>
       <w:r>
         <w:br/>
         <w:t>- 10k Ohm weerstanden</w:t>
@@ -2029,15 +1762,7 @@
         </w:numPr>
       </w:pPr>
       <w:r>
-        <w:t xml:space="preserve">Sluit de </w:t>
-      </w:r>
-      <w:proofErr w:type="spellStart"/>
-      <w:r>
-        <w:t>Mosfet</w:t>
-      </w:r>
-      <w:proofErr w:type="spellEnd"/>
-      <w:r>
-        <w:t xml:space="preserve"> schakelingen aan op de ESP32 zoals op het elektrische schema</w:t>
+        <w:t>Sluit de Mosfet schakelingen aan op de ESP32 zoals op het elektrische schema</w:t>
       </w:r>
     </w:p>
     <w:p>
@@ -2049,15 +1774,7 @@
         </w:numPr>
       </w:pPr>
       <w:r>
-        <w:t xml:space="preserve">Sluit de ESP32 aan op de laptop met de </w:t>
-      </w:r>
-      <w:proofErr w:type="spellStart"/>
-      <w:r>
-        <w:t>MicroUSB</w:t>
-      </w:r>
-      <w:proofErr w:type="spellEnd"/>
-      <w:r>
-        <w:t xml:space="preserve"> naar USBA kabel</w:t>
+        <w:t>Sluit de ESP32 aan op de laptop met de MicroUSB naar USBA kabel</w:t>
       </w:r>
     </w:p>
     <w:p>
@@ -2141,23 +1858,7 @@
     </w:p>
     <w:p>
       <w:r>
-        <w:t xml:space="preserve">De waterpompen worden correct aangestuurd op basis van de signalen die de </w:t>
-      </w:r>
-      <w:proofErr w:type="spellStart"/>
-      <w:r>
-        <w:t>arduino</w:t>
-      </w:r>
-      <w:proofErr w:type="spellEnd"/>
-      <w:r>
-        <w:t xml:space="preserve"> uitstuurt, door middel van de </w:t>
-      </w:r>
-      <w:proofErr w:type="spellStart"/>
-      <w:r>
-        <w:t>Mosfets</w:t>
-      </w:r>
-      <w:proofErr w:type="spellEnd"/>
-      <w:r>
-        <w:t xml:space="preserve">. </w:t>
+        <w:t xml:space="preserve">De waterpompen worden correct aangestuurd op basis van de signalen die de arduino uitstuurt, door middel van de Mosfets. </w:t>
       </w:r>
     </w:p>
     <w:p>
@@ -2277,15 +1978,7 @@
         <w:t xml:space="preserve">en een verandering is nodig, </w:t>
       </w:r>
       <w:r>
-        <w:t xml:space="preserve">moeten de pompen in beweging komen om de </w:t>
-      </w:r>
-      <w:proofErr w:type="spellStart"/>
-      <w:r>
-        <w:t>Floating</w:t>
-      </w:r>
-      <w:proofErr w:type="spellEnd"/>
-      <w:r>
-        <w:t xml:space="preserve"> Farm te stabiliseren. </w:t>
+        <w:t xml:space="preserve">moeten de pompen in beweging komen om de Floating Farm te stabiliseren. </w:t>
       </w:r>
     </w:p>
     <w:p>
@@ -2302,27 +1995,11 @@
       </w:r>
       <w:r>
         <w:br/>
-        <w:t xml:space="preserve">- Schaalmodel </w:t>
-      </w:r>
-      <w:proofErr w:type="spellStart"/>
-      <w:r>
-        <w:t>Floating</w:t>
-      </w:r>
-      <w:proofErr w:type="spellEnd"/>
-      <w:r>
-        <w:t xml:space="preserve"> Farm</w:t>
+        <w:t>- Schaalmodel Floating Farm</w:t>
       </w:r>
       <w:r>
         <w:br/>
-        <w:t xml:space="preserve">- Laptop met een manier om code up te </w:t>
-      </w:r>
-      <w:proofErr w:type="spellStart"/>
-      <w:r>
-        <w:t>loaden</w:t>
-      </w:r>
-      <w:proofErr w:type="spellEnd"/>
-      <w:r>
-        <w:t xml:space="preserve"> naar de ESP32</w:t>
+        <w:t>- Laptop met een manier om code up te loaden naar de ESP32</w:t>
       </w:r>
       <w:r>
         <w:br/>
@@ -2330,13 +2007,8 @@
       </w:r>
       <w:r>
         <w:br/>
-        <w:t xml:space="preserve">- MPU-6050 </w:t>
-      </w:r>
-      <w:proofErr w:type="spellStart"/>
-      <w:r>
-        <w:t>accelerometer</w:t>
-      </w:r>
-      <w:proofErr w:type="spellEnd"/>
+        <w:t>- MPU-6050 accelerometer</w:t>
+      </w:r>
       <w:r>
         <w:br/>
         <w:t>- ESP32 code</w:t>
@@ -2347,13 +2019,8 @@
       </w:r>
       <w:r>
         <w:br/>
-        <w:t xml:space="preserve">- 4 </w:t>
-      </w:r>
-      <w:proofErr w:type="spellStart"/>
-      <w:r>
-        <w:t>Mosfets</w:t>
-      </w:r>
-      <w:proofErr w:type="spellEnd"/>
+        <w:t>- 4 Mosfets</w:t>
+      </w:r>
       <w:r>
         <w:br/>
         <w:t>- 4 miniatuur waterpompen + bijbehorende buizen</w:t>
@@ -2380,15 +2047,7 @@
         </w:numPr>
       </w:pPr>
       <w:r>
-        <w:t xml:space="preserve">Sluit de Accelerometer en waterpompen met de </w:t>
-      </w:r>
-      <w:proofErr w:type="spellStart"/>
-      <w:r>
-        <w:t>Mosfets</w:t>
-      </w:r>
-      <w:proofErr w:type="spellEnd"/>
-      <w:r>
-        <w:t xml:space="preserve"> aan op de ESP volgens het elektrische schema. </w:t>
+        <w:t xml:space="preserve">Sluit de Accelerometer en waterpompen met de Mosfets aan op de ESP volgens het elektrische schema. </w:t>
       </w:r>
     </w:p>
     <w:p>
@@ -2412,15 +2071,7 @@
         </w:numPr>
       </w:pPr>
       <w:r>
-        <w:t xml:space="preserve">Open de verwezen code en download de benodigde </w:t>
-      </w:r>
-      <w:proofErr w:type="spellStart"/>
-      <w:r>
-        <w:t>libraries</w:t>
-      </w:r>
-      <w:proofErr w:type="spellEnd"/>
-      <w:r>
-        <w:t xml:space="preserve"> </w:t>
+        <w:t xml:space="preserve">Open de verwezen code en download de benodigde libraries </w:t>
       </w:r>
     </w:p>
     <w:p>
@@ -2519,15 +2170,7 @@
           </w:tcPr>
           <w:p>
             <w:r>
-              <w:t xml:space="preserve">Het stabilisatiesysteem stabiliseert de </w:t>
-            </w:r>
-            <w:proofErr w:type="spellStart"/>
-            <w:r>
-              <w:t>floating</w:t>
-            </w:r>
-            <w:proofErr w:type="spellEnd"/>
-            <w:r>
-              <w:t xml:space="preserve"> farm, maar niet binnen 10 graden afwijking.</w:t>
+              <w:t>Het stabilisatiesysteem stabiliseert de floating farm, maar niet binnen 10 graden afwijking.</w:t>
             </w:r>
           </w:p>
         </w:tc>
@@ -2543,15 +2186,7 @@
     </w:p>
     <w:p>
       <w:r>
-        <w:t xml:space="preserve">De test is compleet als het systeem de </w:t>
-      </w:r>
-      <w:proofErr w:type="spellStart"/>
-      <w:r>
-        <w:t>floating</w:t>
-      </w:r>
-      <w:proofErr w:type="spellEnd"/>
-      <w:r>
-        <w:t xml:space="preserve"> farm stabiliseert voordat het 10 graden afwijking heeft.</w:t>
+        <w:t>De test is compleet als het systeem de floating farm stabiliseert voordat het 10 graden afwijking heeft.</w:t>
       </w:r>
     </w:p>
     <w:p>
@@ -2690,15 +2325,7 @@
         </w:numPr>
       </w:pPr>
       <w:r>
-        <w:t xml:space="preserve">Schaalmodel van de </w:t>
-      </w:r>
-      <w:proofErr w:type="spellStart"/>
-      <w:r>
-        <w:t>floating</w:t>
-      </w:r>
-      <w:proofErr w:type="spellEnd"/>
-      <w:r>
-        <w:t xml:space="preserve"> farm met 4 waterdichte ballasttanks</w:t>
+        <w:t>Schaalmodel van de floating farm met 4 waterdichte ballasttanks</w:t>
       </w:r>
     </w:p>
     <w:p>
@@ -2861,6 +2488,28 @@
           </w:p>
         </w:tc>
       </w:tr>
+      <w:tr>
+        <w:tc>
+          <w:tcPr>
+            <w:tcW w:w="1255" w:type="dxa"/>
+          </w:tcPr>
+          <w:p>
+            <w:r>
+              <w:t>2</w:t>
+            </w:r>
+          </w:p>
+        </w:tc>
+        <w:tc>
+          <w:tcPr>
+            <w:tcW w:w="7807" w:type="dxa"/>
+          </w:tcPr>
+          <w:p>
+            <w:r>
+              <w:t>De ballasttanks lekken een beetje bij de connectiepunt tussen de  buizen en de tank.</w:t>
+            </w:r>
+          </w:p>
+        </w:tc>
+      </w:tr>
     </w:tbl>
     <w:p>
       <w:pPr>
@@ -2939,6 +2588,28 @@
             </w:r>
             <w:r>
               <w:t>2 ballasttanks</w:t>
+            </w:r>
+          </w:p>
+        </w:tc>
+      </w:tr>
+      <w:tr>
+        <w:tc>
+          <w:tcPr>
+            <w:tcW w:w="1345" w:type="dxa"/>
+          </w:tcPr>
+          <w:p>
+            <w:r>
+              <w:t>2</w:t>
+            </w:r>
+          </w:p>
+        </w:tc>
+        <w:tc>
+          <w:tcPr>
+            <w:tcW w:w="7717" w:type="dxa"/>
+          </w:tcPr>
+          <w:p>
+            <w:r>
+              <w:t>Lek bij de transitie tussen de ballasttanks</w:t>
             </w:r>
           </w:p>
         </w:tc>

</xml_diff>

<commit_message>
Testplan en Uitgaves aangepast
</commit_message>
<xml_diff>
--- a/Opleverset/Documentatie/Testplan.docx
+++ b/Opleverset/Documentatie/Testplan.docx
@@ -12,100 +12,23 @@
     </w:p>
     <w:p/>
     <w:p>
-      <w:r>
-        <w:t>Wat moeten wij gaan testen?</w:t>
-      </w:r>
-    </w:p>
-    <w:p>
-      <w:pPr>
-        <w:pStyle w:val="ListParagraph"/>
-        <w:numPr>
-          <w:ilvl w:val="0"/>
-          <w:numId w:val="5"/>
-        </w:numPr>
-        <w:rPr>
-          <w:color w:val="4EA72E" w:themeColor="accent6"/>
-        </w:rPr>
-      </w:pPr>
-      <w:r>
-        <w:rPr>
-          <w:color w:val="4EA72E" w:themeColor="accent6"/>
-        </w:rPr>
-        <w:t>Functionaliteit van de sensor</w:t>
-      </w:r>
-      <w:r>
-        <w:rPr>
-          <w:color w:val="4EA72E" w:themeColor="accent6"/>
-        </w:rPr>
-        <w:t xml:space="preserve"> </w:t>
-      </w:r>
-    </w:p>
-    <w:p>
-      <w:pPr>
-        <w:pStyle w:val="ListParagraph"/>
-        <w:numPr>
-          <w:ilvl w:val="0"/>
-          <w:numId w:val="5"/>
-        </w:numPr>
-        <w:rPr>
-          <w:color w:val="4EA72E" w:themeColor="accent6"/>
-        </w:rPr>
-      </w:pPr>
-      <w:r>
-        <w:rPr>
-          <w:color w:val="4EA72E" w:themeColor="accent6"/>
-        </w:rPr>
-        <w:t>Robuustheid van het schaalmodel</w:t>
-      </w:r>
-    </w:p>
-    <w:p>
-      <w:pPr>
-        <w:pStyle w:val="ListParagraph"/>
-        <w:numPr>
-          <w:ilvl w:val="0"/>
-          <w:numId w:val="5"/>
-        </w:numPr>
-        <w:rPr>
-          <w:color w:val="4EA72E" w:themeColor="accent6"/>
-        </w:rPr>
-      </w:pPr>
-      <w:r>
-        <w:rPr>
-          <w:color w:val="4EA72E" w:themeColor="accent6"/>
-        </w:rPr>
-        <w:t>Aansturing van de pompen</w:t>
-      </w:r>
-    </w:p>
-    <w:p>
-      <w:pPr>
-        <w:pStyle w:val="ListParagraph"/>
-        <w:numPr>
-          <w:ilvl w:val="0"/>
-          <w:numId w:val="5"/>
-        </w:numPr>
-        <w:rPr>
-          <w:color w:val="4EA72E" w:themeColor="accent6"/>
-        </w:rPr>
-      </w:pPr>
-      <w:r>
-        <w:rPr>
-          <w:color w:val="4EA72E" w:themeColor="accent6"/>
-        </w:rPr>
-        <w:t>Updaten van interface</w:t>
-      </w:r>
-    </w:p>
-    <w:p>
-      <w:pPr>
-        <w:pStyle w:val="ListParagraph"/>
-        <w:numPr>
-          <w:ilvl w:val="0"/>
-          <w:numId w:val="5"/>
-        </w:numPr>
-        <w:shd w:val="clear" w:color="auto" w:fill="FFFFFF" w:themeFill="background1"/>
-        <w:rPr>
-          <w:color w:val="000000" w:themeColor="text1"/>
-        </w:rPr>
-      </w:pPr>
+      <w:pPr>
+        <w:pStyle w:val="Heading1"/>
+      </w:pPr>
+      <w:bookmarkStart w:id="0" w:name="_Toc220413266"/>
+      <w:r>
+        <w:t>Inhoudsopgave</w:t>
+      </w:r>
+      <w:bookmarkEnd w:id="0"/>
+      <w:r>
+        <w:fldChar w:fldCharType="begin"/>
+      </w:r>
+      <w:r>
+        <w:instrText xml:space="preserve"> TOC \o "1-1" \h \z \u </w:instrText>
+      </w:r>
+      <w:r>
+        <w:fldChar w:fldCharType="separate"/>
+      </w:r>
     </w:p>
     <w:p>
       <w:pPr>
@@ -121,16 +44,7 @@
           <w:lang w:eastAsia="nl-NL"/>
         </w:rPr>
       </w:pPr>
-      <w:r>
-        <w:fldChar w:fldCharType="begin"/>
-      </w:r>
-      <w:r>
-        <w:instrText xml:space="preserve"> TOC \o "1-1" \h \z \u </w:instrText>
-      </w:r>
-      <w:r>
-        <w:fldChar w:fldCharType="separate"/>
-      </w:r>
-      <w:hyperlink w:anchor="_Toc219467631" w:history="1">
+      <w:hyperlink w:anchor="_Toc220413267" w:history="1">
         <w:r>
           <w:rPr>
             <w:rStyle w:val="Hyperlink"/>
@@ -157,7 +71,7 @@
             <w:noProof/>
             <w:webHidden/>
           </w:rPr>
-          <w:instrText xml:space="preserve"> PAGEREF _Toc219467631 \h </w:instrText>
+          <w:instrText xml:space="preserve"> PAGEREF _Toc220413267 \h </w:instrText>
         </w:r>
         <w:r>
           <w:rPr>
@@ -202,7 +116,7 @@
           <w:lang w:eastAsia="nl-NL"/>
         </w:rPr>
       </w:pPr>
-      <w:hyperlink w:anchor="_Toc219467632" w:history="1">
+      <w:hyperlink w:anchor="_Toc220413268" w:history="1">
         <w:r>
           <w:rPr>
             <w:rStyle w:val="Hyperlink"/>
@@ -229,7 +143,7 @@
             <w:noProof/>
             <w:webHidden/>
           </w:rPr>
-          <w:instrText xml:space="preserve"> PAGEREF _Toc219467632 \h </w:instrText>
+          <w:instrText xml:space="preserve"> PAGEREF _Toc220413268 \h </w:instrText>
         </w:r>
         <w:r>
           <w:rPr>
@@ -274,7 +188,7 @@
           <w:lang w:eastAsia="nl-NL"/>
         </w:rPr>
       </w:pPr>
-      <w:hyperlink w:anchor="_Toc219467633" w:history="1">
+      <w:hyperlink w:anchor="_Toc220413269" w:history="1">
         <w:r>
           <w:rPr>
             <w:rStyle w:val="Hyperlink"/>
@@ -301,7 +215,7 @@
             <w:noProof/>
             <w:webHidden/>
           </w:rPr>
-          <w:instrText xml:space="preserve"> PAGEREF _Toc219467633 \h </w:instrText>
+          <w:instrText xml:space="preserve"> PAGEREF _Toc220413269 \h </w:instrText>
         </w:r>
         <w:r>
           <w:rPr>
@@ -346,7 +260,7 @@
           <w:lang w:eastAsia="nl-NL"/>
         </w:rPr>
       </w:pPr>
-      <w:hyperlink w:anchor="_Toc219467634" w:history="1">
+      <w:hyperlink w:anchor="_Toc220413270" w:history="1">
         <w:r>
           <w:rPr>
             <w:rStyle w:val="Hyperlink"/>
@@ -373,7 +287,7 @@
             <w:noProof/>
             <w:webHidden/>
           </w:rPr>
-          <w:instrText xml:space="preserve"> PAGEREF _Toc219467634 \h </w:instrText>
+          <w:instrText xml:space="preserve"> PAGEREF _Toc220413270 \h </w:instrText>
         </w:r>
         <w:r>
           <w:rPr>
@@ -418,7 +332,7 @@
           <w:lang w:eastAsia="nl-NL"/>
         </w:rPr>
       </w:pPr>
-      <w:hyperlink w:anchor="_Toc219467635" w:history="1">
+      <w:hyperlink w:anchor="_Toc220413271" w:history="1">
         <w:r>
           <w:rPr>
             <w:rStyle w:val="Hyperlink"/>
@@ -445,7 +359,7 @@
             <w:noProof/>
             <w:webHidden/>
           </w:rPr>
-          <w:instrText xml:space="preserve"> PAGEREF _Toc219467635 \h </w:instrText>
+          <w:instrText xml:space="preserve"> PAGEREF _Toc220413271 \h </w:instrText>
         </w:r>
         <w:r>
           <w:rPr>
@@ -490,7 +404,7 @@
           <w:lang w:eastAsia="nl-NL"/>
         </w:rPr>
       </w:pPr>
-      <w:hyperlink w:anchor="_Toc219467636" w:history="1">
+      <w:hyperlink w:anchor="_Toc220413272" w:history="1">
         <w:r>
           <w:rPr>
             <w:rStyle w:val="Hyperlink"/>
@@ -517,7 +431,7 @@
             <w:noProof/>
             <w:webHidden/>
           </w:rPr>
-          <w:instrText xml:space="preserve"> PAGEREF _Toc219467636 \h </w:instrText>
+          <w:instrText xml:space="preserve"> PAGEREF _Toc220413272 \h </w:instrText>
         </w:r>
         <w:r>
           <w:rPr>
@@ -562,7 +476,7 @@
           <w:lang w:eastAsia="nl-NL"/>
         </w:rPr>
       </w:pPr>
-      <w:hyperlink w:anchor="_Toc219467637" w:history="1">
+      <w:hyperlink w:anchor="_Toc220413273" w:history="1">
         <w:r>
           <w:rPr>
             <w:rStyle w:val="Hyperlink"/>
@@ -589,7 +503,7 @@
             <w:noProof/>
             <w:webHidden/>
           </w:rPr>
-          <w:instrText xml:space="preserve"> PAGEREF _Toc219467637 \h </w:instrText>
+          <w:instrText xml:space="preserve"> PAGEREF _Toc220413273 \h </w:instrText>
         </w:r>
         <w:r>
           <w:rPr>
@@ -632,7 +546,7 @@
       <w:pPr>
         <w:pStyle w:val="Heading1"/>
       </w:pPr>
-      <w:bookmarkStart w:id="0" w:name="_Toc219467631"/>
+      <w:bookmarkStart w:id="1" w:name="_Toc220413267"/>
       <w:r>
         <w:lastRenderedPageBreak/>
         <w:t>Test 1</w:t>
@@ -640,7 +554,7 @@
       <w:r>
         <w:t>: Het schaalmodel kan drijven op water</w:t>
       </w:r>
-      <w:bookmarkEnd w:id="0"/>
+      <w:bookmarkEnd w:id="1"/>
     </w:p>
     <w:p>
       <w:pPr>
@@ -922,12 +836,12 @@
       <w:pPr>
         <w:pStyle w:val="Heading1"/>
       </w:pPr>
-      <w:bookmarkStart w:id="1" w:name="_Toc219467632"/>
+      <w:bookmarkStart w:id="2" w:name="_Toc220413268"/>
       <w:r>
         <w:lastRenderedPageBreak/>
         <w:t>Test 2: Sensorlezingen op waterpas</w:t>
       </w:r>
-      <w:bookmarkEnd w:id="1"/>
+      <w:bookmarkEnd w:id="2"/>
     </w:p>
     <w:p>
       <w:pPr>
@@ -1356,7 +1270,7 @@
       <w:pPr>
         <w:pStyle w:val="Heading1"/>
       </w:pPr>
-      <w:bookmarkStart w:id="2" w:name="_Toc219467633"/>
+      <w:bookmarkStart w:id="3" w:name="_Toc220413269"/>
       <w:r>
         <w:lastRenderedPageBreak/>
         <w:t xml:space="preserve">Test 3: </w:t>
@@ -1364,7 +1278,7 @@
       <w:r>
         <w:t>Update interface</w:t>
       </w:r>
-      <w:bookmarkEnd w:id="2"/>
+      <w:bookmarkEnd w:id="3"/>
     </w:p>
     <w:p>
       <w:pPr>
@@ -1846,7 +1760,7 @@
           </w:tcPr>
           <w:p>
             <w:r>
-              <w:t>-</w:t>
+              <w:t>De lampjes en de interface lopen synchroon en geven hetzelfde weer.</w:t>
             </w:r>
           </w:p>
         </w:tc>
@@ -1863,7 +1777,30 @@
     </w:p>
     <w:p>
       <w:r>
-        <w:t>(Hier beschrijf je je bevindingen. Houd je waarnemingen naast de acceptatiecriteria en stel dan of de test succesvol was of niet.)</w:t>
+        <w:t xml:space="preserve">Test succesvol, de </w:t>
+      </w:r>
+      <w:proofErr w:type="spellStart"/>
+      <w:r>
+        <w:t>Unity</w:t>
+      </w:r>
+      <w:proofErr w:type="spellEnd"/>
+      <w:r>
+        <w:t xml:space="preserve"> Interface past zich correct aan</w:t>
+      </w:r>
+      <w:r>
+        <w:t xml:space="preserve"> in relatie tot</w:t>
+      </w:r>
+      <w:r>
+        <w:t xml:space="preserve"> de</w:t>
+      </w:r>
+      <w:r>
+        <w:t xml:space="preserve"> positie van de MPU6050, en de motor</w:t>
+      </w:r>
+      <w:r>
+        <w:t>-</w:t>
+      </w:r>
+      <w:r>
+        <w:t>statussen worden correct bijgehouden.</w:t>
       </w:r>
     </w:p>
     <w:p/>
@@ -1871,7 +1808,7 @@
       <w:pPr>
         <w:pStyle w:val="Heading1"/>
       </w:pPr>
-      <w:bookmarkStart w:id="3" w:name="_Toc219467634"/>
+      <w:bookmarkStart w:id="4" w:name="_Toc220413270"/>
       <w:r>
         <w:lastRenderedPageBreak/>
         <w:t xml:space="preserve">Test </w:t>
@@ -1895,7 +1832,7 @@
       <w:r>
         <w:t>Mosfets</w:t>
       </w:r>
-      <w:bookmarkEnd w:id="3"/>
+      <w:bookmarkEnd w:id="4"/>
       <w:proofErr w:type="spellEnd"/>
     </w:p>
     <w:p>
@@ -1934,7 +1871,7 @@
           <w:noProof/>
         </w:rPr>
         <w:drawing>
-          <wp:anchor distT="0" distB="0" distL="114300" distR="114300" simplePos="0" relativeHeight="251658240" behindDoc="0" locked="0" layoutInCell="1" allowOverlap="1" wp14:anchorId="1C9F4511" wp14:editId="2E868195">
+          <wp:anchor distT="0" distB="0" distL="114300" distR="114300" simplePos="0" relativeHeight="251658240" behindDoc="0" locked="0" layoutInCell="1" allowOverlap="1" wp14:anchorId="1C9F4511" wp14:editId="7C585D73">
             <wp:simplePos x="0" y="0"/>
             <wp:positionH relativeFrom="page">
               <wp:align>right</wp:align>
@@ -2365,13 +2302,7 @@
         <w:t xml:space="preserve">consistent aan met de toegediende stroom, </w:t>
       </w:r>
       <w:r>
-        <w:t xml:space="preserve">en blijven aan tot de stroom eraf </w:t>
-      </w:r>
-      <w:r>
-        <w:t>word</w:t>
-      </w:r>
-      <w:r>
-        <w:t xml:space="preserve"> gehaald. </w:t>
+        <w:t xml:space="preserve">en blijven aan tot de stroom eraf word gehaald. </w:t>
       </w:r>
       <w:r>
         <w:br w:type="page"/>
@@ -2381,7 +2312,7 @@
       <w:pPr>
         <w:pStyle w:val="Heading1"/>
       </w:pPr>
-      <w:bookmarkStart w:id="4" w:name="_Toc219467635"/>
+      <w:bookmarkStart w:id="5" w:name="_Toc220413271"/>
       <w:r>
         <w:lastRenderedPageBreak/>
         <w:t xml:space="preserve">Test </w:t>
@@ -2395,7 +2326,7 @@
       <w:r>
         <w:t>Algoritme gebaseerd op sensordata</w:t>
       </w:r>
-      <w:bookmarkEnd w:id="4"/>
+      <w:bookmarkEnd w:id="5"/>
     </w:p>
     <w:p>
       <w:pPr>
@@ -2756,7 +2687,7 @@
       <w:pPr>
         <w:pStyle w:val="Heading1"/>
       </w:pPr>
-      <w:bookmarkStart w:id="5" w:name="_Toc219467636"/>
+      <w:bookmarkStart w:id="6" w:name="_Toc220413272"/>
       <w:r>
         <w:lastRenderedPageBreak/>
         <w:t xml:space="preserve">Test </w:t>
@@ -2770,7 +2701,7 @@
       <w:r>
         <w:t>Waterdichtheid van de ballasttanks</w:t>
       </w:r>
-      <w:bookmarkEnd w:id="5"/>
+      <w:bookmarkEnd w:id="6"/>
     </w:p>
     <w:p>
       <w:pPr>
@@ -3180,14 +3111,14 @@
       <w:pPr>
         <w:pStyle w:val="Heading1"/>
       </w:pPr>
-      <w:bookmarkStart w:id="6" w:name="_Toc213669770"/>
-      <w:bookmarkStart w:id="7" w:name="_Toc219467637"/>
+      <w:bookmarkStart w:id="7" w:name="_Toc213669770"/>
+      <w:bookmarkStart w:id="8" w:name="_Toc220413273"/>
       <w:r>
         <w:lastRenderedPageBreak/>
         <w:t>Changelog</w:t>
       </w:r>
-      <w:bookmarkEnd w:id="6"/>
       <w:bookmarkEnd w:id="7"/>
+      <w:bookmarkEnd w:id="8"/>
     </w:p>
     <w:tbl>
       <w:tblPr>

</xml_diff>